<commit_message>
docs: update documentation and PRD to v5.4
Reflects all execution friction fixes: 9:45 AM premarket start, 15-min
intraday, 1M volume floor, live price refresh, limit orders, prompt
caching, strategy pre-filter, cron-job.org, and eval date filter fix.
Build log updated through step 60; issues table updated; what's next
updated with pre-real-money P0 items.

Co-Authored-By: Claude Sonnet 4.6 <noreply@anthropic.com>
</commit_message>
<xml_diff>
--- a/Trading_Agent_PRD.docx
+++ b/Trading_Agent_PRD.docx
@@ -23,7 +23,7 @@
           <w:b/>
           <w:sz w:val="28"/>
         </w:rPr>
-        <w:t>AI Trading Agent (PRD) — v5.3</w:t>
+        <w:t>AI Trading Agent (PRD) — v5.4</w:t>
       </w:r>
     </w:p>
     <w:p>
@@ -357,7 +357,7 @@
         <w:spacing w:after="120"/>
       </w:pPr>
       <w:r>
-        <w:t>The AI Trading Agent is a fully autonomous stock trading simulation system. Every weekday it wakes up at 9AM ET, checks market conditions (VIX, futures, international markets), scans 430+ stocks and ETFs for high-conviction setups, filters out earnings-risk tickers, uses Claude AI to select and validate trades, simulates position management throughout the day, and produces a complete performance record — all without any human input.</w:t>
+        <w:t>The AI Trading Agent is a fully autonomous stock trading simulation system. Every weekday it wakes up at 9:45 AM ET (skipping first 15 min of wide spreads), checks market conditions (VIX, futures, international markets), scans 450+ stocks and ETFs for high-conviction setups, filters out earnings-risk tickers, uses Claude AI to select and validate trades, simulates position management throughout the day, and produces a complete performance record — all without any human input.</w:t>
       </w:r>
     </w:p>
     <w:p>
@@ -2606,71 +2606,43 @@
           <w:tcPr>
             <w:tcW w:type="dxa" w:w="1234"/>
           </w:tcPr>
-          <w:p>
-            <w:r>
-              <w:t>Technical scanner (430+ tickers)</w:t>
-            </w:r>
-          </w:p>
-        </w:tc>
-        <w:tc>
-          <w:tcPr>
-            <w:tcW w:type="dxa" w:w="1234"/>
-          </w:tcPr>
-          <w:p>
-            <w:r>
-              <w:t>High</w:t>
-            </w:r>
-          </w:p>
-        </w:tc>
-        <w:tc>
-          <w:tcPr>
-            <w:tcW w:type="dxa" w:w="1234"/>
-          </w:tcPr>
-          <w:p>
-            <w:r>
-              <w:t>High</w:t>
-            </w:r>
-          </w:p>
-        </w:tc>
-        <w:tc>
-          <w:tcPr>
-            <w:tcW w:type="dxa" w:w="1234"/>
-          </w:tcPr>
-          <w:p>
-            <w:r>
-              <w:t>95%</w:t>
-            </w:r>
-          </w:p>
-        </w:tc>
-        <w:tc>
-          <w:tcPr>
-            <w:tcW w:type="dxa" w:w="1234"/>
-          </w:tcPr>
-          <w:p>
-            <w:r>
-              <w:t>M</w:t>
-            </w:r>
-          </w:p>
-        </w:tc>
-        <w:tc>
-          <w:tcPr>
-            <w:tcW w:type="dxa" w:w="1234"/>
-          </w:tcPr>
-          <w:p>
-            <w:r>
-              <w:t>9.5</w:t>
-            </w:r>
-          </w:p>
-        </w:tc>
-        <w:tc>
-          <w:tcPr>
-            <w:tcW w:type="dxa" w:w="1234"/>
-          </w:tcPr>
-          <w:p>
-            <w:r>
-              <w:t>P0 — shipped</w:t>
-            </w:r>
-          </w:p>
+          <w:p/>
+        </w:tc>
+        <w:tc>
+          <w:tcPr>
+            <w:tcW w:type="dxa" w:w="1234"/>
+          </w:tcPr>
+          <w:p/>
+        </w:tc>
+        <w:tc>
+          <w:tcPr>
+            <w:tcW w:type="dxa" w:w="1234"/>
+          </w:tcPr>
+          <w:p/>
+        </w:tc>
+        <w:tc>
+          <w:tcPr>
+            <w:tcW w:type="dxa" w:w="1234"/>
+          </w:tcPr>
+          <w:p/>
+        </w:tc>
+        <w:tc>
+          <w:tcPr>
+            <w:tcW w:type="dxa" w:w="1234"/>
+          </w:tcPr>
+          <w:p/>
+        </w:tc>
+        <w:tc>
+          <w:tcPr>
+            <w:tcW w:type="dxa" w:w="1234"/>
+          </w:tcPr>
+          <w:p/>
+        </w:tc>
+        <w:tc>
+          <w:tcPr>
+            <w:tcW w:type="dxa" w:w="1234"/>
+          </w:tcPr>
+          <w:p/>
         </w:tc>
       </w:tr>
       <w:tr>
@@ -2678,71 +2650,43 @@
           <w:tcPr>
             <w:tcW w:type="dxa" w:w="1234"/>
           </w:tcPr>
-          <w:p>
-            <w:r>
-              <w:t>Claude strategy agent</w:t>
-            </w:r>
-          </w:p>
-        </w:tc>
-        <w:tc>
-          <w:tcPr>
-            <w:tcW w:type="dxa" w:w="1234"/>
-          </w:tcPr>
-          <w:p>
-            <w:r>
-              <w:t>High</w:t>
-            </w:r>
-          </w:p>
-        </w:tc>
-        <w:tc>
-          <w:tcPr>
-            <w:tcW w:type="dxa" w:w="1234"/>
-          </w:tcPr>
-          <w:p>
-            <w:r>
-              <w:t>High</w:t>
-            </w:r>
-          </w:p>
-        </w:tc>
-        <w:tc>
-          <w:tcPr>
-            <w:tcW w:type="dxa" w:w="1234"/>
-          </w:tcPr>
-          <w:p>
-            <w:r>
-              <w:t>90%</w:t>
-            </w:r>
-          </w:p>
-        </w:tc>
-        <w:tc>
-          <w:tcPr>
-            <w:tcW w:type="dxa" w:w="1234"/>
-          </w:tcPr>
-          <w:p>
-            <w:r>
-              <w:t>M</w:t>
-            </w:r>
-          </w:p>
-        </w:tc>
-        <w:tc>
-          <w:tcPr>
-            <w:tcW w:type="dxa" w:w="1234"/>
-          </w:tcPr>
-          <w:p>
-            <w:r>
-              <w:t>9.0</w:t>
-            </w:r>
-          </w:p>
-        </w:tc>
-        <w:tc>
-          <w:tcPr>
-            <w:tcW w:type="dxa" w:w="1234"/>
-          </w:tcPr>
-          <w:p>
-            <w:r>
-              <w:t>P0 — shipped</w:t>
-            </w:r>
-          </w:p>
+          <w:p/>
+        </w:tc>
+        <w:tc>
+          <w:tcPr>
+            <w:tcW w:type="dxa" w:w="1234"/>
+          </w:tcPr>
+          <w:p/>
+        </w:tc>
+        <w:tc>
+          <w:tcPr>
+            <w:tcW w:type="dxa" w:w="1234"/>
+          </w:tcPr>
+          <w:p/>
+        </w:tc>
+        <w:tc>
+          <w:tcPr>
+            <w:tcW w:type="dxa" w:w="1234"/>
+          </w:tcPr>
+          <w:p/>
+        </w:tc>
+        <w:tc>
+          <w:tcPr>
+            <w:tcW w:type="dxa" w:w="1234"/>
+          </w:tcPr>
+          <w:p/>
+        </w:tc>
+        <w:tc>
+          <w:tcPr>
+            <w:tcW w:type="dxa" w:w="1234"/>
+          </w:tcPr>
+          <w:p/>
+        </w:tc>
+        <w:tc>
+          <w:tcPr>
+            <w:tcW w:type="dxa" w:w="1234"/>
+          </w:tcPr>
+          <w:p/>
         </w:tc>
       </w:tr>
       <w:tr>
@@ -2750,71 +2694,43 @@
           <w:tcPr>
             <w:tcW w:type="dxa" w:w="1234"/>
           </w:tcPr>
-          <w:p>
-            <w:r>
-              <w:t>Claude risk agent</w:t>
-            </w:r>
-          </w:p>
-        </w:tc>
-        <w:tc>
-          <w:tcPr>
-            <w:tcW w:type="dxa" w:w="1234"/>
-          </w:tcPr>
-          <w:p>
-            <w:r>
-              <w:t>High</w:t>
-            </w:r>
-          </w:p>
-        </w:tc>
-        <w:tc>
-          <w:tcPr>
-            <w:tcW w:type="dxa" w:w="1234"/>
-          </w:tcPr>
-          <w:p>
-            <w:r>
-              <w:t>High</w:t>
-            </w:r>
-          </w:p>
-        </w:tc>
-        <w:tc>
-          <w:tcPr>
-            <w:tcW w:type="dxa" w:w="1234"/>
-          </w:tcPr>
-          <w:p>
-            <w:r>
-              <w:t>95%</w:t>
-            </w:r>
-          </w:p>
-        </w:tc>
-        <w:tc>
-          <w:tcPr>
-            <w:tcW w:type="dxa" w:w="1234"/>
-          </w:tcPr>
-          <w:p>
-            <w:r>
-              <w:t>S</w:t>
-            </w:r>
-          </w:p>
-        </w:tc>
-        <w:tc>
-          <w:tcPr>
-            <w:tcW w:type="dxa" w:w="1234"/>
-          </w:tcPr>
-          <w:p>
-            <w:r>
-              <w:t>9.5</w:t>
-            </w:r>
-          </w:p>
-        </w:tc>
-        <w:tc>
-          <w:tcPr>
-            <w:tcW w:type="dxa" w:w="1234"/>
-          </w:tcPr>
-          <w:p>
-            <w:r>
-              <w:t>P0 — shipped</w:t>
-            </w:r>
-          </w:p>
+          <w:p/>
+        </w:tc>
+        <w:tc>
+          <w:tcPr>
+            <w:tcW w:type="dxa" w:w="1234"/>
+          </w:tcPr>
+          <w:p/>
+        </w:tc>
+        <w:tc>
+          <w:tcPr>
+            <w:tcW w:type="dxa" w:w="1234"/>
+          </w:tcPr>
+          <w:p/>
+        </w:tc>
+        <w:tc>
+          <w:tcPr>
+            <w:tcW w:type="dxa" w:w="1234"/>
+          </w:tcPr>
+          <w:p/>
+        </w:tc>
+        <w:tc>
+          <w:tcPr>
+            <w:tcW w:type="dxa" w:w="1234"/>
+          </w:tcPr>
+          <w:p/>
+        </w:tc>
+        <w:tc>
+          <w:tcPr>
+            <w:tcW w:type="dxa" w:w="1234"/>
+          </w:tcPr>
+          <w:p/>
+        </w:tc>
+        <w:tc>
+          <w:tcPr>
+            <w:tcW w:type="dxa" w:w="1234"/>
+          </w:tcPr>
+          <w:p/>
         </w:tc>
       </w:tr>
       <w:tr>
@@ -2822,71 +2738,43 @@
           <w:tcPr>
             <w:tcW w:type="dxa" w:w="1234"/>
           </w:tcPr>
-          <w:p>
-            <w:r>
-              <w:t>GitHub Actions scheduler</w:t>
-            </w:r>
-          </w:p>
-        </w:tc>
-        <w:tc>
-          <w:tcPr>
-            <w:tcW w:type="dxa" w:w="1234"/>
-          </w:tcPr>
-          <w:p>
-            <w:r>
-              <w:t>High</w:t>
-            </w:r>
-          </w:p>
-        </w:tc>
-        <w:tc>
-          <w:tcPr>
-            <w:tcW w:type="dxa" w:w="1234"/>
-          </w:tcPr>
-          <w:p>
-            <w:r>
-              <w:t>High</w:t>
-            </w:r>
-          </w:p>
-        </w:tc>
-        <w:tc>
-          <w:tcPr>
-            <w:tcW w:type="dxa" w:w="1234"/>
-          </w:tcPr>
-          <w:p>
-            <w:r>
-              <w:t>99%</w:t>
-            </w:r>
-          </w:p>
-        </w:tc>
-        <w:tc>
-          <w:tcPr>
-            <w:tcW w:type="dxa" w:w="1234"/>
-          </w:tcPr>
-          <w:p>
-            <w:r>
-              <w:t>S</w:t>
-            </w:r>
-          </w:p>
-        </w:tc>
-        <w:tc>
-          <w:tcPr>
-            <w:tcW w:type="dxa" w:w="1234"/>
-          </w:tcPr>
-          <w:p>
-            <w:r>
-              <w:t>9.9</w:t>
-            </w:r>
-          </w:p>
-        </w:tc>
-        <w:tc>
-          <w:tcPr>
-            <w:tcW w:type="dxa" w:w="1234"/>
-          </w:tcPr>
-          <w:p>
-            <w:r>
-              <w:t>P0 — shipped</w:t>
-            </w:r>
-          </w:p>
+          <w:p/>
+        </w:tc>
+        <w:tc>
+          <w:tcPr>
+            <w:tcW w:type="dxa" w:w="1234"/>
+          </w:tcPr>
+          <w:p/>
+        </w:tc>
+        <w:tc>
+          <w:tcPr>
+            <w:tcW w:type="dxa" w:w="1234"/>
+          </w:tcPr>
+          <w:p/>
+        </w:tc>
+        <w:tc>
+          <w:tcPr>
+            <w:tcW w:type="dxa" w:w="1234"/>
+          </w:tcPr>
+          <w:p/>
+        </w:tc>
+        <w:tc>
+          <w:tcPr>
+            <w:tcW w:type="dxa" w:w="1234"/>
+          </w:tcPr>
+          <w:p/>
+        </w:tc>
+        <w:tc>
+          <w:tcPr>
+            <w:tcW w:type="dxa" w:w="1234"/>
+          </w:tcPr>
+          <w:p/>
+        </w:tc>
+        <w:tc>
+          <w:tcPr>
+            <w:tcW w:type="dxa" w:w="1234"/>
+          </w:tcPr>
+          <w:p/>
         </w:tc>
       </w:tr>
       <w:tr>
@@ -2894,71 +2782,43 @@
           <w:tcPr>
             <w:tcW w:type="dxa" w:w="1234"/>
           </w:tcPr>
-          <w:p>
-            <w:r>
-              <w:t>Supabase persistence</w:t>
-            </w:r>
-          </w:p>
-        </w:tc>
-        <w:tc>
-          <w:tcPr>
-            <w:tcW w:type="dxa" w:w="1234"/>
-          </w:tcPr>
-          <w:p>
-            <w:r>
-              <w:t>High</w:t>
-            </w:r>
-          </w:p>
-        </w:tc>
-        <w:tc>
-          <w:tcPr>
-            <w:tcW w:type="dxa" w:w="1234"/>
-          </w:tcPr>
-          <w:p>
-            <w:r>
-              <w:t>High</w:t>
-            </w:r>
-          </w:p>
-        </w:tc>
-        <w:tc>
-          <w:tcPr>
-            <w:tcW w:type="dxa" w:w="1234"/>
-          </w:tcPr>
-          <w:p>
-            <w:r>
-              <w:t>99%</w:t>
-            </w:r>
-          </w:p>
-        </w:tc>
-        <w:tc>
-          <w:tcPr>
-            <w:tcW w:type="dxa" w:w="1234"/>
-          </w:tcPr>
-          <w:p>
-            <w:r>
-              <w:t>S</w:t>
-            </w:r>
-          </w:p>
-        </w:tc>
-        <w:tc>
-          <w:tcPr>
-            <w:tcW w:type="dxa" w:w="1234"/>
-          </w:tcPr>
-          <w:p>
-            <w:r>
-              <w:t>9.9</w:t>
-            </w:r>
-          </w:p>
-        </w:tc>
-        <w:tc>
-          <w:tcPr>
-            <w:tcW w:type="dxa" w:w="1234"/>
-          </w:tcPr>
-          <w:p>
-            <w:r>
-              <w:t>P0 — shipped</w:t>
-            </w:r>
-          </w:p>
+          <w:p/>
+        </w:tc>
+        <w:tc>
+          <w:tcPr>
+            <w:tcW w:type="dxa" w:w="1234"/>
+          </w:tcPr>
+          <w:p/>
+        </w:tc>
+        <w:tc>
+          <w:tcPr>
+            <w:tcW w:type="dxa" w:w="1234"/>
+          </w:tcPr>
+          <w:p/>
+        </w:tc>
+        <w:tc>
+          <w:tcPr>
+            <w:tcW w:type="dxa" w:w="1234"/>
+          </w:tcPr>
+          <w:p/>
+        </w:tc>
+        <w:tc>
+          <w:tcPr>
+            <w:tcW w:type="dxa" w:w="1234"/>
+          </w:tcPr>
+          <w:p/>
+        </w:tc>
+        <w:tc>
+          <w:tcPr>
+            <w:tcW w:type="dxa" w:w="1234"/>
+          </w:tcPr>
+          <w:p/>
+        </w:tc>
+        <w:tc>
+          <w:tcPr>
+            <w:tcW w:type="dxa" w:w="1234"/>
+          </w:tcPr>
+          <w:p/>
         </w:tc>
       </w:tr>
       <w:tr>
@@ -2966,71 +2826,43 @@
           <w:tcPr>
             <w:tcW w:type="dxa" w:w="1234"/>
           </w:tcPr>
-          <w:p>
-            <w:r>
-              <w:t>30-day backtesting (backtest.py)</w:t>
-            </w:r>
-          </w:p>
-        </w:tc>
-        <w:tc>
-          <w:tcPr>
-            <w:tcW w:type="dxa" w:w="1234"/>
-          </w:tcPr>
-          <w:p>
-            <w:r>
-              <w:t>High</w:t>
-            </w:r>
-          </w:p>
-        </w:tc>
-        <w:tc>
-          <w:tcPr>
-            <w:tcW w:type="dxa" w:w="1234"/>
-          </w:tcPr>
-          <w:p>
-            <w:r>
-              <w:t>High</w:t>
-            </w:r>
-          </w:p>
-        </w:tc>
-        <w:tc>
-          <w:tcPr>
-            <w:tcW w:type="dxa" w:w="1234"/>
-          </w:tcPr>
-          <w:p>
-            <w:r>
-              <w:t>95%</w:t>
-            </w:r>
-          </w:p>
-        </w:tc>
-        <w:tc>
-          <w:tcPr>
-            <w:tcW w:type="dxa" w:w="1234"/>
-          </w:tcPr>
-          <w:p>
-            <w:r>
-              <w:t>M</w:t>
-            </w:r>
-          </w:p>
-        </w:tc>
-        <w:tc>
-          <w:tcPr>
-            <w:tcW w:type="dxa" w:w="1234"/>
-          </w:tcPr>
-          <w:p>
-            <w:r>
-              <w:t>9.5</w:t>
-            </w:r>
-          </w:p>
-        </w:tc>
-        <w:tc>
-          <w:tcPr>
-            <w:tcW w:type="dxa" w:w="1234"/>
-          </w:tcPr>
-          <w:p>
-            <w:r>
-              <w:t>P0 — shipped</w:t>
-            </w:r>
-          </w:p>
+          <w:p/>
+        </w:tc>
+        <w:tc>
+          <w:tcPr>
+            <w:tcW w:type="dxa" w:w="1234"/>
+          </w:tcPr>
+          <w:p/>
+        </w:tc>
+        <w:tc>
+          <w:tcPr>
+            <w:tcW w:type="dxa" w:w="1234"/>
+          </w:tcPr>
+          <w:p/>
+        </w:tc>
+        <w:tc>
+          <w:tcPr>
+            <w:tcW w:type="dxa" w:w="1234"/>
+          </w:tcPr>
+          <w:p/>
+        </w:tc>
+        <w:tc>
+          <w:tcPr>
+            <w:tcW w:type="dxa" w:w="1234"/>
+          </w:tcPr>
+          <w:p/>
+        </w:tc>
+        <w:tc>
+          <w:tcPr>
+            <w:tcW w:type="dxa" w:w="1234"/>
+          </w:tcPr>
+          <w:p/>
+        </w:tc>
+        <w:tc>
+          <w:tcPr>
+            <w:tcW w:type="dxa" w:w="1234"/>
+          </w:tcPr>
+          <w:p/>
         </w:tc>
       </w:tr>
       <w:tr>
@@ -3038,71 +2870,43 @@
           <w:tcPr>
             <w:tcW w:type="dxa" w:w="1234"/>
           </w:tcPr>
-          <w:p>
-            <w:r>
-              <w:t>V2a: VIX + futures gate</w:t>
-            </w:r>
-          </w:p>
-        </w:tc>
-        <w:tc>
-          <w:tcPr>
-            <w:tcW w:type="dxa" w:w="1234"/>
-          </w:tcPr>
-          <w:p>
-            <w:r>
-              <w:t>High</w:t>
-            </w:r>
-          </w:p>
-        </w:tc>
-        <w:tc>
-          <w:tcPr>
-            <w:tcW w:type="dxa" w:w="1234"/>
-          </w:tcPr>
-          <w:p>
-            <w:r>
-              <w:t>High</w:t>
-            </w:r>
-          </w:p>
-        </w:tc>
-        <w:tc>
-          <w:tcPr>
-            <w:tcW w:type="dxa" w:w="1234"/>
-          </w:tcPr>
-          <w:p>
-            <w:r>
-              <w:t>90%</w:t>
-            </w:r>
-          </w:p>
-        </w:tc>
-        <w:tc>
-          <w:tcPr>
-            <w:tcW w:type="dxa" w:w="1234"/>
-          </w:tcPr>
-          <w:p>
-            <w:r>
-              <w:t>S</w:t>
-            </w:r>
-          </w:p>
-        </w:tc>
-        <w:tc>
-          <w:tcPr>
-            <w:tcW w:type="dxa" w:w="1234"/>
-          </w:tcPr>
-          <w:p>
-            <w:r>
-              <w:t>9.0</w:t>
-            </w:r>
-          </w:p>
-        </w:tc>
-        <w:tc>
-          <w:tcPr>
-            <w:tcW w:type="dxa" w:w="1234"/>
-          </w:tcPr>
-          <w:p>
-            <w:r>
-              <w:t>P1 — shipped</w:t>
-            </w:r>
-          </w:p>
+          <w:p/>
+        </w:tc>
+        <w:tc>
+          <w:tcPr>
+            <w:tcW w:type="dxa" w:w="1234"/>
+          </w:tcPr>
+          <w:p/>
+        </w:tc>
+        <w:tc>
+          <w:tcPr>
+            <w:tcW w:type="dxa" w:w="1234"/>
+          </w:tcPr>
+          <w:p/>
+        </w:tc>
+        <w:tc>
+          <w:tcPr>
+            <w:tcW w:type="dxa" w:w="1234"/>
+          </w:tcPr>
+          <w:p/>
+        </w:tc>
+        <w:tc>
+          <w:tcPr>
+            <w:tcW w:type="dxa" w:w="1234"/>
+          </w:tcPr>
+          <w:p/>
+        </w:tc>
+        <w:tc>
+          <w:tcPr>
+            <w:tcW w:type="dxa" w:w="1234"/>
+          </w:tcPr>
+          <w:p/>
+        </w:tc>
+        <w:tc>
+          <w:tcPr>
+            <w:tcW w:type="dxa" w:w="1234"/>
+          </w:tcPr>
+          <w:p/>
         </w:tc>
       </w:tr>
       <w:tr>
@@ -3110,71 +2914,43 @@
           <w:tcPr>
             <w:tcW w:type="dxa" w:w="1234"/>
           </w:tcPr>
-          <w:p>
-            <w:r>
-              <w:t>V2b: Earnings blackout + news</w:t>
-            </w:r>
-          </w:p>
-        </w:tc>
-        <w:tc>
-          <w:tcPr>
-            <w:tcW w:type="dxa" w:w="1234"/>
-          </w:tcPr>
-          <w:p>
-            <w:r>
-              <w:t>High</w:t>
-            </w:r>
-          </w:p>
-        </w:tc>
-        <w:tc>
-          <w:tcPr>
-            <w:tcW w:type="dxa" w:w="1234"/>
-          </w:tcPr>
-          <w:p>
-            <w:r>
-              <w:t>High</w:t>
-            </w:r>
-          </w:p>
-        </w:tc>
-        <w:tc>
-          <w:tcPr>
-            <w:tcW w:type="dxa" w:w="1234"/>
-          </w:tcPr>
-          <w:p>
-            <w:r>
-              <w:t>90%</w:t>
-            </w:r>
-          </w:p>
-        </w:tc>
-        <w:tc>
-          <w:tcPr>
-            <w:tcW w:type="dxa" w:w="1234"/>
-          </w:tcPr>
-          <w:p>
-            <w:r>
-              <w:t>S</w:t>
-            </w:r>
-          </w:p>
-        </w:tc>
-        <w:tc>
-          <w:tcPr>
-            <w:tcW w:type="dxa" w:w="1234"/>
-          </w:tcPr>
-          <w:p>
-            <w:r>
-              <w:t>9.0</w:t>
-            </w:r>
-          </w:p>
-        </w:tc>
-        <w:tc>
-          <w:tcPr>
-            <w:tcW w:type="dxa" w:w="1234"/>
-          </w:tcPr>
-          <w:p>
-            <w:r>
-              <w:t>P1 — shipped</w:t>
-            </w:r>
-          </w:p>
+          <w:p/>
+        </w:tc>
+        <w:tc>
+          <w:tcPr>
+            <w:tcW w:type="dxa" w:w="1234"/>
+          </w:tcPr>
+          <w:p/>
+        </w:tc>
+        <w:tc>
+          <w:tcPr>
+            <w:tcW w:type="dxa" w:w="1234"/>
+          </w:tcPr>
+          <w:p/>
+        </w:tc>
+        <w:tc>
+          <w:tcPr>
+            <w:tcW w:type="dxa" w:w="1234"/>
+          </w:tcPr>
+          <w:p/>
+        </w:tc>
+        <w:tc>
+          <w:tcPr>
+            <w:tcW w:type="dxa" w:w="1234"/>
+          </w:tcPr>
+          <w:p/>
+        </w:tc>
+        <w:tc>
+          <w:tcPr>
+            <w:tcW w:type="dxa" w:w="1234"/>
+          </w:tcPr>
+          <w:p/>
+        </w:tc>
+        <w:tc>
+          <w:tcPr>
+            <w:tcW w:type="dxa" w:w="1234"/>
+          </w:tcPr>
+          <w:p/>
         </w:tc>
       </w:tr>
       <w:tr>
@@ -3182,71 +2958,43 @@
           <w:tcPr>
             <w:tcW w:type="dxa" w:w="1234"/>
           </w:tcPr>
-          <w:p>
-            <w:r>
-              <w:t>Workflow dashboard (Today tab)</w:t>
-            </w:r>
-          </w:p>
-        </w:tc>
-        <w:tc>
-          <w:tcPr>
-            <w:tcW w:type="dxa" w:w="1234"/>
-          </w:tcPr>
-          <w:p>
-            <w:r>
-              <w:t>High</w:t>
-            </w:r>
-          </w:p>
-        </w:tc>
-        <w:tc>
-          <w:tcPr>
-            <w:tcW w:type="dxa" w:w="1234"/>
-          </w:tcPr>
-          <w:p>
-            <w:r>
-              <w:t>Med</w:t>
-            </w:r>
-          </w:p>
-        </w:tc>
-        <w:tc>
-          <w:tcPr>
-            <w:tcW w:type="dxa" w:w="1234"/>
-          </w:tcPr>
-          <w:p>
-            <w:r>
-              <w:t>90%</w:t>
-            </w:r>
-          </w:p>
-        </w:tc>
-        <w:tc>
-          <w:tcPr>
-            <w:tcW w:type="dxa" w:w="1234"/>
-          </w:tcPr>
-          <w:p>
-            <w:r>
-              <w:t>M</w:t>
-            </w:r>
-          </w:p>
-        </w:tc>
-        <w:tc>
-          <w:tcPr>
-            <w:tcW w:type="dxa" w:w="1234"/>
-          </w:tcPr>
-          <w:p>
-            <w:r>
-              <w:t>8.1</w:t>
-            </w:r>
-          </w:p>
-        </w:tc>
-        <w:tc>
-          <w:tcPr>
-            <w:tcW w:type="dxa" w:w="1234"/>
-          </w:tcPr>
-          <w:p>
-            <w:r>
-              <w:t>P1 — shipped</w:t>
-            </w:r>
-          </w:p>
+          <w:p/>
+        </w:tc>
+        <w:tc>
+          <w:tcPr>
+            <w:tcW w:type="dxa" w:w="1234"/>
+          </w:tcPr>
+          <w:p/>
+        </w:tc>
+        <w:tc>
+          <w:tcPr>
+            <w:tcW w:type="dxa" w:w="1234"/>
+          </w:tcPr>
+          <w:p/>
+        </w:tc>
+        <w:tc>
+          <w:tcPr>
+            <w:tcW w:type="dxa" w:w="1234"/>
+          </w:tcPr>
+          <w:p/>
+        </w:tc>
+        <w:tc>
+          <w:tcPr>
+            <w:tcW w:type="dxa" w:w="1234"/>
+          </w:tcPr>
+          <w:p/>
+        </w:tc>
+        <w:tc>
+          <w:tcPr>
+            <w:tcW w:type="dxa" w:w="1234"/>
+          </w:tcPr>
+          <w:p/>
+        </w:tc>
+        <w:tc>
+          <w:tcPr>
+            <w:tcW w:type="dxa" w:w="1234"/>
+          </w:tcPr>
+          <w:p/>
         </w:tc>
       </w:tr>
       <w:tr>
@@ -3256,17 +3004,7 @@
           </w:tcPr>
           <w:p>
             <w:r>
-              <w:t>Eval script (eval.py)</w:t>
-            </w:r>
-          </w:p>
-        </w:tc>
-        <w:tc>
-          <w:tcPr>
-            <w:tcW w:type="dxa" w:w="1234"/>
-          </w:tcPr>
-          <w:p>
-            <w:r>
-              <w:t>Med</w:t>
+              <w:t>Technical scanner (430+ tickers)</w:t>
             </w:r>
           </w:p>
         </w:tc>
@@ -3286,37 +3024,47 @@
           </w:tcPr>
           <w:p>
             <w:r>
-              <w:t>85%</w:t>
-            </w:r>
-          </w:p>
-        </w:tc>
-        <w:tc>
-          <w:tcPr>
-            <w:tcW w:type="dxa" w:w="1234"/>
-          </w:tcPr>
-          <w:p>
-            <w:r>
-              <w:t>S</w:t>
-            </w:r>
-          </w:p>
-        </w:tc>
-        <w:tc>
-          <w:tcPr>
-            <w:tcW w:type="dxa" w:w="1234"/>
-          </w:tcPr>
-          <w:p>
-            <w:r>
-              <w:t>8.5</w:t>
-            </w:r>
-          </w:p>
-        </w:tc>
-        <w:tc>
-          <w:tcPr>
-            <w:tcW w:type="dxa" w:w="1234"/>
-          </w:tcPr>
-          <w:p>
-            <w:r>
-              <w:t>P1 — shipped</w:t>
+              <w:t>High</w:t>
+            </w:r>
+          </w:p>
+        </w:tc>
+        <w:tc>
+          <w:tcPr>
+            <w:tcW w:type="dxa" w:w="1234"/>
+          </w:tcPr>
+          <w:p>
+            <w:r>
+              <w:t>95%</w:t>
+            </w:r>
+          </w:p>
+        </w:tc>
+        <w:tc>
+          <w:tcPr>
+            <w:tcW w:type="dxa" w:w="1234"/>
+          </w:tcPr>
+          <w:p>
+            <w:r>
+              <w:t>M</w:t>
+            </w:r>
+          </w:p>
+        </w:tc>
+        <w:tc>
+          <w:tcPr>
+            <w:tcW w:type="dxa" w:w="1234"/>
+          </w:tcPr>
+          <w:p>
+            <w:r>
+              <w:t>9.5</w:t>
+            </w:r>
+          </w:p>
+        </w:tc>
+        <w:tc>
+          <w:tcPr>
+            <w:tcW w:type="dxa" w:w="1234"/>
+          </w:tcPr>
+          <w:p>
+            <w:r>
+              <w:t>P0 — shipped</w:t>
             </w:r>
           </w:p>
         </w:tc>
@@ -3328,7 +3076,7 @@
           </w:tcPr>
           <w:p>
             <w:r>
-              <w:t>V2c: Fear &amp; Greed + FOMC/CPI/NFP calendar</w:t>
+              <w:t>Claude strategy agent</w:t>
             </w:r>
           </w:p>
         </w:tc>
@@ -3358,37 +3106,37 @@
           </w:tcPr>
           <w:p>
             <w:r>
-              <w:t>95%</w:t>
-            </w:r>
-          </w:p>
-        </w:tc>
-        <w:tc>
-          <w:tcPr>
-            <w:tcW w:type="dxa" w:w="1234"/>
-          </w:tcPr>
-          <w:p>
-            <w:r>
-              <w:t>S</w:t>
-            </w:r>
-          </w:p>
-        </w:tc>
-        <w:tc>
-          <w:tcPr>
-            <w:tcW w:type="dxa" w:w="1234"/>
-          </w:tcPr>
-          <w:p>
-            <w:r>
-              <w:t>9.5</w:t>
-            </w:r>
-          </w:p>
-        </w:tc>
-        <w:tc>
-          <w:tcPr>
-            <w:tcW w:type="dxa" w:w="1234"/>
-          </w:tcPr>
-          <w:p>
-            <w:r>
-              <w:t>P1 — shipped (v2.2)</w:t>
+              <w:t>90%</w:t>
+            </w:r>
+          </w:p>
+        </w:tc>
+        <w:tc>
+          <w:tcPr>
+            <w:tcW w:type="dxa" w:w="1234"/>
+          </w:tcPr>
+          <w:p>
+            <w:r>
+              <w:t>M</w:t>
+            </w:r>
+          </w:p>
+        </w:tc>
+        <w:tc>
+          <w:tcPr>
+            <w:tcW w:type="dxa" w:w="1234"/>
+          </w:tcPr>
+          <w:p>
+            <w:r>
+              <w:t>9.0</w:t>
+            </w:r>
+          </w:p>
+        </w:tc>
+        <w:tc>
+          <w:tcPr>
+            <w:tcW w:type="dxa" w:w="1234"/>
+          </w:tcPr>
+          <w:p>
+            <w:r>
+              <w:t>P0 — shipped</w:t>
             </w:r>
           </w:p>
         </w:tc>
@@ -3400,7 +3148,7 @@
           </w:tcPr>
           <w:p>
             <w:r>
-              <w:t>V2c.1: Tune F&amp;G to confirming signal</w:t>
+              <w:t>Claude risk agent</w:t>
             </w:r>
           </w:p>
         </w:tc>
@@ -3430,37 +3178,37 @@
           </w:tcPr>
           <w:p>
             <w:r>
-              <w:t>99%</w:t>
-            </w:r>
-          </w:p>
-        </w:tc>
-        <w:tc>
-          <w:tcPr>
-            <w:tcW w:type="dxa" w:w="1234"/>
-          </w:tcPr>
-          <w:p>
-            <w:r>
-              <w:t>XS</w:t>
-            </w:r>
-          </w:p>
-        </w:tc>
-        <w:tc>
-          <w:tcPr>
-            <w:tcW w:type="dxa" w:w="1234"/>
-          </w:tcPr>
-          <w:p>
-            <w:r>
-              <w:t>9.9</w:t>
-            </w:r>
-          </w:p>
-        </w:tc>
-        <w:tc>
-          <w:tcPr>
-            <w:tcW w:type="dxa" w:w="1234"/>
-          </w:tcPr>
-          <w:p>
-            <w:r>
-              <w:t>P1 — shipped (v2.3)</w:t>
+              <w:t>95%</w:t>
+            </w:r>
+          </w:p>
+        </w:tc>
+        <w:tc>
+          <w:tcPr>
+            <w:tcW w:type="dxa" w:w="1234"/>
+          </w:tcPr>
+          <w:p>
+            <w:r>
+              <w:t>S</w:t>
+            </w:r>
+          </w:p>
+        </w:tc>
+        <w:tc>
+          <w:tcPr>
+            <w:tcW w:type="dxa" w:w="1234"/>
+          </w:tcPr>
+          <w:p>
+            <w:r>
+              <w:t>9.5</w:t>
+            </w:r>
+          </w:p>
+        </w:tc>
+        <w:tc>
+          <w:tcPr>
+            <w:tcW w:type="dxa" w:w="1234"/>
+          </w:tcPr>
+          <w:p>
+            <w:r>
+              <w:t>P0 — shipped</w:t>
             </w:r>
           </w:p>
         </w:tc>
@@ -3472,7 +3220,7 @@
           </w:tcPr>
           <w:p>
             <w:r>
-              <w:t>V3a: Dynamic universe refresh (weekly screener)</w:t>
+              <w:t>GitHub Actions scheduler</w:t>
             </w:r>
           </w:p>
         </w:tc>
@@ -3502,37 +3250,37 @@
           </w:tcPr>
           <w:p>
             <w:r>
-              <w:t>95%</w:t>
-            </w:r>
-          </w:p>
-        </w:tc>
-        <w:tc>
-          <w:tcPr>
-            <w:tcW w:type="dxa" w:w="1234"/>
-          </w:tcPr>
-          <w:p>
-            <w:r>
-              <w:t>M</w:t>
-            </w:r>
-          </w:p>
-        </w:tc>
-        <w:tc>
-          <w:tcPr>
-            <w:tcW w:type="dxa" w:w="1234"/>
-          </w:tcPr>
-          <w:p>
-            <w:r>
-              <w:t>9.5</w:t>
-            </w:r>
-          </w:p>
-        </w:tc>
-        <w:tc>
-          <w:tcPr>
-            <w:tcW w:type="dxa" w:w="1234"/>
-          </w:tcPr>
-          <w:p>
-            <w:r>
-              <w:t>P1 — shipped (v3.0)</w:t>
+              <w:t>99%</w:t>
+            </w:r>
+          </w:p>
+        </w:tc>
+        <w:tc>
+          <w:tcPr>
+            <w:tcW w:type="dxa" w:w="1234"/>
+          </w:tcPr>
+          <w:p>
+            <w:r>
+              <w:t>S</w:t>
+            </w:r>
+          </w:p>
+        </w:tc>
+        <w:tc>
+          <w:tcPr>
+            <w:tcW w:type="dxa" w:w="1234"/>
+          </w:tcPr>
+          <w:p>
+            <w:r>
+              <w:t>9.9</w:t>
+            </w:r>
+          </w:p>
+        </w:tc>
+        <w:tc>
+          <w:tcPr>
+            <w:tcW w:type="dxa" w:w="1234"/>
+          </w:tcPr>
+          <w:p>
+            <w:r>
+              <w:t>P0 — shipped</w:t>
             </w:r>
           </w:p>
         </w:tc>
@@ -3544,7 +3292,7 @@
           </w:tcPr>
           <w:p>
             <w:r>
-              <w:t>Dashboard company names column</w:t>
+              <w:t>Supabase persistence</w:t>
             </w:r>
           </w:p>
         </w:tc>
@@ -3564,7 +3312,7 @@
           </w:tcPr>
           <w:p>
             <w:r>
-              <w:t>Med</w:t>
+              <w:t>High</w:t>
             </w:r>
           </w:p>
         </w:tc>
@@ -3594,17 +3342,17 @@
           </w:tcPr>
           <w:p>
             <w:r>
-              <w:t>9.0</w:t>
-            </w:r>
-          </w:p>
-        </w:tc>
-        <w:tc>
-          <w:tcPr>
-            <w:tcW w:type="dxa" w:w="1234"/>
-          </w:tcPr>
-          <w:p>
-            <w:r>
-              <w:t>P1 — shipped (v3.0)</w:t>
+              <w:t>9.9</w:t>
+            </w:r>
+          </w:p>
+        </w:tc>
+        <w:tc>
+          <w:tcPr>
+            <w:tcW w:type="dxa" w:w="1234"/>
+          </w:tcPr>
+          <w:p>
+            <w:r>
+              <w:t>P0 — shipped</w:t>
             </w:r>
           </w:p>
         </w:tc>
@@ -3616,67 +3364,67 @@
           </w:tcPr>
           <w:p>
             <w:r>
-              <w:t>V2d: Sector correlation guard</w:t>
-            </w:r>
-          </w:p>
-        </w:tc>
-        <w:tc>
-          <w:tcPr>
-            <w:tcW w:type="dxa" w:w="1234"/>
-          </w:tcPr>
-          <w:p>
-            <w:r>
-              <w:t>Med</w:t>
-            </w:r>
-          </w:p>
-        </w:tc>
-        <w:tc>
-          <w:tcPr>
-            <w:tcW w:type="dxa" w:w="1234"/>
-          </w:tcPr>
-          <w:p>
-            <w:r>
-              <w:t>Med</w:t>
-            </w:r>
-          </w:p>
-        </w:tc>
-        <w:tc>
-          <w:tcPr>
-            <w:tcW w:type="dxa" w:w="1234"/>
-          </w:tcPr>
-          <w:p>
-            <w:r>
-              <w:t>80%</w:t>
-            </w:r>
-          </w:p>
-        </w:tc>
-        <w:tc>
-          <w:tcPr>
-            <w:tcW w:type="dxa" w:w="1234"/>
-          </w:tcPr>
-          <w:p>
-            <w:r>
-              <w:t>S</w:t>
-            </w:r>
-          </w:p>
-        </w:tc>
-        <w:tc>
-          <w:tcPr>
-            <w:tcW w:type="dxa" w:w="1234"/>
-          </w:tcPr>
-          <w:p>
-            <w:r>
-              <w:t>7.2</w:t>
-            </w:r>
-          </w:p>
-        </w:tc>
-        <w:tc>
-          <w:tcPr>
-            <w:tcW w:type="dxa" w:w="1234"/>
-          </w:tcPr>
-          <w:p>
-            <w:r>
-              <w:t>P1 — shipped (v4.1)</w:t>
+              <w:t>30-day backtesting (backtest.py)</w:t>
+            </w:r>
+          </w:p>
+        </w:tc>
+        <w:tc>
+          <w:tcPr>
+            <w:tcW w:type="dxa" w:w="1234"/>
+          </w:tcPr>
+          <w:p>
+            <w:r>
+              <w:t>High</w:t>
+            </w:r>
+          </w:p>
+        </w:tc>
+        <w:tc>
+          <w:tcPr>
+            <w:tcW w:type="dxa" w:w="1234"/>
+          </w:tcPr>
+          <w:p>
+            <w:r>
+              <w:t>High</w:t>
+            </w:r>
+          </w:p>
+        </w:tc>
+        <w:tc>
+          <w:tcPr>
+            <w:tcW w:type="dxa" w:w="1234"/>
+          </w:tcPr>
+          <w:p>
+            <w:r>
+              <w:t>95%</w:t>
+            </w:r>
+          </w:p>
+        </w:tc>
+        <w:tc>
+          <w:tcPr>
+            <w:tcW w:type="dxa" w:w="1234"/>
+          </w:tcPr>
+          <w:p>
+            <w:r>
+              <w:t>M</w:t>
+            </w:r>
+          </w:p>
+        </w:tc>
+        <w:tc>
+          <w:tcPr>
+            <w:tcW w:type="dxa" w:w="1234"/>
+          </w:tcPr>
+          <w:p>
+            <w:r>
+              <w:t>9.5</w:t>
+            </w:r>
+          </w:p>
+        </w:tc>
+        <w:tc>
+          <w:tcPr>
+            <w:tcW w:type="dxa" w:w="1234"/>
+          </w:tcPr>
+          <w:p>
+            <w:r>
+              <w:t>P0 — shipped</w:t>
             </w:r>
           </w:p>
         </w:tc>
@@ -3688,7 +3436,7 @@
           </w:tcPr>
           <w:p>
             <w:r>
-              <w:t>V5: Guardrails (6 safety checks)</w:t>
+              <w:t>V2a: VIX + futures gate</w:t>
             </w:r>
           </w:p>
         </w:tc>
@@ -3718,7 +3466,7 @@
           </w:tcPr>
           <w:p>
             <w:r>
-              <w:t>99%</w:t>
+              <w:t>90%</w:t>
             </w:r>
           </w:p>
         </w:tc>
@@ -3738,17 +3486,17 @@
           </w:tcPr>
           <w:p>
             <w:r>
-              <w:t>9.9</w:t>
-            </w:r>
-          </w:p>
-        </w:tc>
-        <w:tc>
-          <w:tcPr>
-            <w:tcW w:type="dxa" w:w="1234"/>
-          </w:tcPr>
-          <w:p>
-            <w:r>
-              <w:t>P0 — shipped (v5.0)</w:t>
+              <w:t>9.0</w:t>
+            </w:r>
+          </w:p>
+        </w:tc>
+        <w:tc>
+          <w:tcPr>
+            <w:tcW w:type="dxa" w:w="1234"/>
+          </w:tcPr>
+          <w:p>
+            <w:r>
+              <w:t>P1 — shipped</w:t>
             </w:r>
           </w:p>
         </w:tc>
@@ -3760,7 +3508,7 @@
           </w:tcPr>
           <w:p>
             <w:r>
-              <w:t>Summary tab: In Flight / Plan / Heatmap</w:t>
+              <w:t>V2b: Earnings blackout + news</w:t>
             </w:r>
           </w:p>
         </w:tc>
@@ -3790,7 +3538,7 @@
           </w:tcPr>
           <w:p>
             <w:r>
-              <w:t>99%</w:t>
+              <w:t>90%</w:t>
             </w:r>
           </w:p>
         </w:tc>
@@ -3810,17 +3558,17 @@
           </w:tcPr>
           <w:p>
             <w:r>
-              <w:t>9.9</w:t>
-            </w:r>
-          </w:p>
-        </w:tc>
-        <w:tc>
-          <w:tcPr>
-            <w:tcW w:type="dxa" w:w="1234"/>
-          </w:tcPr>
-          <w:p>
-            <w:r>
-              <w:t>P1 — shipped (v5.1)</w:t>
+              <w:t>9.0</w:t>
+            </w:r>
+          </w:p>
+        </w:tc>
+        <w:tc>
+          <w:tcPr>
+            <w:tcW w:type="dxa" w:w="1234"/>
+          </w:tcPr>
+          <w:p>
+            <w:r>
+              <w:t>P1 — shipped</w:t>
             </w:r>
           </w:p>
         </w:tc>
@@ -3832,7 +3580,7 @@
           </w:tcPr>
           <w:p>
             <w:r>
-              <w:t>Automated EOD eval + Agent Scorecard</w:t>
+              <w:t>Workflow dashboard (Today tab)</w:t>
             </w:r>
           </w:p>
         </w:tc>
@@ -3852,47 +3600,47 @@
           </w:tcPr>
           <w:p>
             <w:r>
-              <w:t>High</w:t>
-            </w:r>
-          </w:p>
-        </w:tc>
-        <w:tc>
-          <w:tcPr>
-            <w:tcW w:type="dxa" w:w="1234"/>
-          </w:tcPr>
-          <w:p>
-            <w:r>
-              <w:t>99%</w:t>
-            </w:r>
-          </w:p>
-        </w:tc>
-        <w:tc>
-          <w:tcPr>
-            <w:tcW w:type="dxa" w:w="1234"/>
-          </w:tcPr>
-          <w:p>
-            <w:r>
-              <w:t>S</w:t>
-            </w:r>
-          </w:p>
-        </w:tc>
-        <w:tc>
-          <w:tcPr>
-            <w:tcW w:type="dxa" w:w="1234"/>
-          </w:tcPr>
-          <w:p>
-            <w:r>
-              <w:t>9.9</w:t>
-            </w:r>
-          </w:p>
-        </w:tc>
-        <w:tc>
-          <w:tcPr>
-            <w:tcW w:type="dxa" w:w="1234"/>
-          </w:tcPr>
-          <w:p>
-            <w:r>
-              <w:t>P1 — shipped (v5.1)</w:t>
+              <w:t>Med</w:t>
+            </w:r>
+          </w:p>
+        </w:tc>
+        <w:tc>
+          <w:tcPr>
+            <w:tcW w:type="dxa" w:w="1234"/>
+          </w:tcPr>
+          <w:p>
+            <w:r>
+              <w:t>90%</w:t>
+            </w:r>
+          </w:p>
+        </w:tc>
+        <w:tc>
+          <w:tcPr>
+            <w:tcW w:type="dxa" w:w="1234"/>
+          </w:tcPr>
+          <w:p>
+            <w:r>
+              <w:t>M</w:t>
+            </w:r>
+          </w:p>
+        </w:tc>
+        <w:tc>
+          <w:tcPr>
+            <w:tcW w:type="dxa" w:w="1234"/>
+          </w:tcPr>
+          <w:p>
+            <w:r>
+              <w:t>8.1</w:t>
+            </w:r>
+          </w:p>
+        </w:tc>
+        <w:tc>
+          <w:tcPr>
+            <w:tcW w:type="dxa" w:w="1234"/>
+          </w:tcPr>
+          <w:p>
+            <w:r>
+              <w:t>P1 — shipped</w:t>
             </w:r>
           </w:p>
         </w:tc>
@@ -3904,7 +3652,17 @@
           </w:tcPr>
           <w:p>
             <w:r>
-              <w:t>Alpaca position reconciliation (UNFILLED)</w:t>
+              <w:t>Eval script (eval.py)</w:t>
+            </w:r>
+          </w:p>
+        </w:tc>
+        <w:tc>
+          <w:tcPr>
+            <w:tcW w:type="dxa" w:w="1234"/>
+          </w:tcPr>
+          <w:p>
+            <w:r>
+              <w:t>Med</w:t>
             </w:r>
           </w:p>
         </w:tc>
@@ -3924,17 +3682,7 @@
           </w:tcPr>
           <w:p>
             <w:r>
-              <w:t>High</w:t>
-            </w:r>
-          </w:p>
-        </w:tc>
-        <w:tc>
-          <w:tcPr>
-            <w:tcW w:type="dxa" w:w="1234"/>
-          </w:tcPr>
-          <w:p>
-            <w:r>
-              <w:t>95%</w:t>
+              <w:t>85%</w:t>
             </w:r>
           </w:p>
         </w:tc>
@@ -3954,17 +3702,17 @@
           </w:tcPr>
           <w:p>
             <w:r>
-              <w:t>9.5</w:t>
-            </w:r>
-          </w:p>
-        </w:tc>
-        <w:tc>
-          <w:tcPr>
-            <w:tcW w:type="dxa" w:w="1234"/>
-          </w:tcPr>
-          <w:p>
-            <w:r>
-              <w:t>P1 — shipped (v5.1)</w:t>
+              <w:t>8.5</w:t>
+            </w:r>
+          </w:p>
+        </w:tc>
+        <w:tc>
+          <w:tcPr>
+            <w:tcW w:type="dxa" w:w="1234"/>
+          </w:tcPr>
+          <w:p>
+            <w:r>
+              <w:t>P1 — shipped</w:t>
             </w:r>
           </w:p>
         </w:tc>
@@ -3976,7 +3724,7 @@
           </w:tcPr>
           <w:p>
             <w:r>
-              <w:t>No-margin cumulative capital check</w:t>
+              <w:t>V2c: Fear &amp; Greed + FOMC/CPI/NFP calendar</w:t>
             </w:r>
           </w:p>
         </w:tc>
@@ -4006,7 +3754,7 @@
           </w:tcPr>
           <w:p>
             <w:r>
-              <w:t>99%</w:t>
+              <w:t>95%</w:t>
             </w:r>
           </w:p>
         </w:tc>
@@ -4026,17 +3774,17 @@
           </w:tcPr>
           <w:p>
             <w:r>
-              <w:t>9.9</w:t>
-            </w:r>
-          </w:p>
-        </w:tc>
-        <w:tc>
-          <w:tcPr>
-            <w:tcW w:type="dxa" w:w="1234"/>
-          </w:tcPr>
-          <w:p>
-            <w:r>
-              <w:t>P0 — shipped (v5.2)</w:t>
+              <w:t>9.5</w:t>
+            </w:r>
+          </w:p>
+        </w:tc>
+        <w:tc>
+          <w:tcPr>
+            <w:tcW w:type="dxa" w:w="1234"/>
+          </w:tcPr>
+          <w:p>
+            <w:r>
+              <w:t>P1 — shipped (v2.2)</w:t>
             </w:r>
           </w:p>
         </w:tc>
@@ -4048,7 +3796,7 @@
           </w:tcPr>
           <w:p>
             <w:r>
-              <w:t>Daily profit lock-in (LOCK_IN at $716)</w:t>
+              <w:t>V2c.1: Tune F&amp;G to confirming signal</w:t>
             </w:r>
           </w:p>
         </w:tc>
@@ -4078,37 +3826,37 @@
           </w:tcPr>
           <w:p>
             <w:r>
-              <w:t>95%</w:t>
-            </w:r>
-          </w:p>
-        </w:tc>
-        <w:tc>
-          <w:tcPr>
-            <w:tcW w:type="dxa" w:w="1234"/>
-          </w:tcPr>
-          <w:p>
-            <w:r>
-              <w:t>S</w:t>
-            </w:r>
-          </w:p>
-        </w:tc>
-        <w:tc>
-          <w:tcPr>
-            <w:tcW w:type="dxa" w:w="1234"/>
-          </w:tcPr>
-          <w:p>
-            <w:r>
-              <w:t>9.5</w:t>
-            </w:r>
-          </w:p>
-        </w:tc>
-        <w:tc>
-          <w:tcPr>
-            <w:tcW w:type="dxa" w:w="1234"/>
-          </w:tcPr>
-          <w:p>
-            <w:r>
-              <w:t>P1 — shipped (v5.2)</w:t>
+              <w:t>99%</w:t>
+            </w:r>
+          </w:p>
+        </w:tc>
+        <w:tc>
+          <w:tcPr>
+            <w:tcW w:type="dxa" w:w="1234"/>
+          </w:tcPr>
+          <w:p>
+            <w:r>
+              <w:t>XS</w:t>
+            </w:r>
+          </w:p>
+        </w:tc>
+        <w:tc>
+          <w:tcPr>
+            <w:tcW w:type="dxa" w:w="1234"/>
+          </w:tcPr>
+          <w:p>
+            <w:r>
+              <w:t>9.9</w:t>
+            </w:r>
+          </w:p>
+        </w:tc>
+        <w:tc>
+          <w:tcPr>
+            <w:tcW w:type="dxa" w:w="1234"/>
+          </w:tcPr>
+          <w:p>
+            <w:r>
+              <w:t>P1 — shipped (v2.3)</w:t>
             </w:r>
           </w:p>
         </w:tc>
@@ -4120,7 +3868,7 @@
           </w:tcPr>
           <w:p>
             <w:r>
-              <w:t>GitHub Actions retry (3x with 60s backoff)</w:t>
+              <w:t>V3a: Dynamic universe refresh (weekly screener)</w:t>
             </w:r>
           </w:p>
         </w:tc>
@@ -4150,37 +3898,37 @@
           </w:tcPr>
           <w:p>
             <w:r>
-              <w:t>99%</w:t>
-            </w:r>
-          </w:p>
-        </w:tc>
-        <w:tc>
-          <w:tcPr>
-            <w:tcW w:type="dxa" w:w="1234"/>
-          </w:tcPr>
-          <w:p>
-            <w:r>
-              <w:t>XS</w:t>
-            </w:r>
-          </w:p>
-        </w:tc>
-        <w:tc>
-          <w:tcPr>
-            <w:tcW w:type="dxa" w:w="1234"/>
-          </w:tcPr>
-          <w:p>
-            <w:r>
-              <w:t>9.9</w:t>
-            </w:r>
-          </w:p>
-        </w:tc>
-        <w:tc>
-          <w:tcPr>
-            <w:tcW w:type="dxa" w:w="1234"/>
-          </w:tcPr>
-          <w:p>
-            <w:r>
-              <w:t>P0 — shipped (v5.3)</w:t>
+              <w:t>95%</w:t>
+            </w:r>
+          </w:p>
+        </w:tc>
+        <w:tc>
+          <w:tcPr>
+            <w:tcW w:type="dxa" w:w="1234"/>
+          </w:tcPr>
+          <w:p>
+            <w:r>
+              <w:t>M</w:t>
+            </w:r>
+          </w:p>
+        </w:tc>
+        <w:tc>
+          <w:tcPr>
+            <w:tcW w:type="dxa" w:w="1234"/>
+          </w:tcPr>
+          <w:p>
+            <w:r>
+              <w:t>9.5</w:t>
+            </w:r>
+          </w:p>
+        </w:tc>
+        <w:tc>
+          <w:tcPr>
+            <w:tcW w:type="dxa" w:w="1234"/>
+          </w:tcPr>
+          <w:p>
+            <w:r>
+              <w:t>P1 — shipped (v3.0)</w:t>
             </w:r>
           </w:p>
         </w:tc>
@@ -4192,7 +3940,7 @@
           </w:tcPr>
           <w:p>
             <w:r>
-              <w:t>Trailing stops (high_watermark + 1% trail)</w:t>
+              <w:t>Dashboard company names column</w:t>
             </w:r>
           </w:p>
         </w:tc>
@@ -4212,17 +3960,17 @@
           </w:tcPr>
           <w:p>
             <w:r>
-              <w:t>High</w:t>
-            </w:r>
-          </w:p>
-        </w:tc>
-        <w:tc>
-          <w:tcPr>
-            <w:tcW w:type="dxa" w:w="1234"/>
-          </w:tcPr>
-          <w:p>
-            <w:r>
-              <w:t>90%</w:t>
+              <w:t>Med</w:t>
+            </w:r>
+          </w:p>
+        </w:tc>
+        <w:tc>
+          <w:tcPr>
+            <w:tcW w:type="dxa" w:w="1234"/>
+          </w:tcPr>
+          <w:p>
+            <w:r>
+              <w:t>99%</w:t>
             </w:r>
           </w:p>
         </w:tc>
@@ -4252,7 +4000,7 @@
           </w:tcPr>
           <w:p>
             <w:r>
-              <w:t>P1 — shipped (v5.3)</w:t>
+              <w:t>P1 — shipped (v3.0)</w:t>
             </w:r>
           </w:p>
         </w:tc>
@@ -4264,17 +4012,7 @@
           </w:tcPr>
           <w:p>
             <w:r>
-              <w:t>Confidence-weighted position sizing</w:t>
-            </w:r>
-          </w:p>
-        </w:tc>
-        <w:tc>
-          <w:tcPr>
-            <w:tcW w:type="dxa" w:w="1234"/>
-          </w:tcPr>
-          <w:p>
-            <w:r>
-              <w:t>High</w:t>
+              <w:t>V2d: Sector correlation guard</w:t>
             </w:r>
           </w:p>
         </w:tc>
@@ -4294,37 +4032,47 @@
           </w:tcPr>
           <w:p>
             <w:r>
-              <w:t>95%</w:t>
-            </w:r>
-          </w:p>
-        </w:tc>
-        <w:tc>
-          <w:tcPr>
-            <w:tcW w:type="dxa" w:w="1234"/>
-          </w:tcPr>
-          <w:p>
-            <w:r>
-              <w:t>XS</w:t>
-            </w:r>
-          </w:p>
-        </w:tc>
-        <w:tc>
-          <w:tcPr>
-            <w:tcW w:type="dxa" w:w="1234"/>
-          </w:tcPr>
-          <w:p>
-            <w:r>
-              <w:t>8.6</w:t>
-            </w:r>
-          </w:p>
-        </w:tc>
-        <w:tc>
-          <w:tcPr>
-            <w:tcW w:type="dxa" w:w="1234"/>
-          </w:tcPr>
-          <w:p>
-            <w:r>
-              <w:t>P1 — shipped (v5.3)</w:t>
+              <w:t>Med</w:t>
+            </w:r>
+          </w:p>
+        </w:tc>
+        <w:tc>
+          <w:tcPr>
+            <w:tcW w:type="dxa" w:w="1234"/>
+          </w:tcPr>
+          <w:p>
+            <w:r>
+              <w:t>80%</w:t>
+            </w:r>
+          </w:p>
+        </w:tc>
+        <w:tc>
+          <w:tcPr>
+            <w:tcW w:type="dxa" w:w="1234"/>
+          </w:tcPr>
+          <w:p>
+            <w:r>
+              <w:t>S</w:t>
+            </w:r>
+          </w:p>
+        </w:tc>
+        <w:tc>
+          <w:tcPr>
+            <w:tcW w:type="dxa" w:w="1234"/>
+          </w:tcPr>
+          <w:p>
+            <w:r>
+              <w:t>7.2</w:t>
+            </w:r>
+          </w:p>
+        </w:tc>
+        <w:tc>
+          <w:tcPr>
+            <w:tcW w:type="dxa" w:w="1234"/>
+          </w:tcPr>
+          <w:p>
+            <w:r>
+              <w:t>P1 — shipped (v4.1)</w:t>
             </w:r>
           </w:p>
         </w:tc>
@@ -4336,6 +4084,654 @@
           </w:tcPr>
           <w:p>
             <w:r>
+              <w:t>V5: Guardrails (6 safety checks)</w:t>
+            </w:r>
+          </w:p>
+        </w:tc>
+        <w:tc>
+          <w:tcPr>
+            <w:tcW w:type="dxa" w:w="1234"/>
+          </w:tcPr>
+          <w:p>
+            <w:r>
+              <w:t>High</w:t>
+            </w:r>
+          </w:p>
+        </w:tc>
+        <w:tc>
+          <w:tcPr>
+            <w:tcW w:type="dxa" w:w="1234"/>
+          </w:tcPr>
+          <w:p>
+            <w:r>
+              <w:t>High</w:t>
+            </w:r>
+          </w:p>
+        </w:tc>
+        <w:tc>
+          <w:tcPr>
+            <w:tcW w:type="dxa" w:w="1234"/>
+          </w:tcPr>
+          <w:p>
+            <w:r>
+              <w:t>99%</w:t>
+            </w:r>
+          </w:p>
+        </w:tc>
+        <w:tc>
+          <w:tcPr>
+            <w:tcW w:type="dxa" w:w="1234"/>
+          </w:tcPr>
+          <w:p>
+            <w:r>
+              <w:t>S</w:t>
+            </w:r>
+          </w:p>
+        </w:tc>
+        <w:tc>
+          <w:tcPr>
+            <w:tcW w:type="dxa" w:w="1234"/>
+          </w:tcPr>
+          <w:p>
+            <w:r>
+              <w:t>9.9</w:t>
+            </w:r>
+          </w:p>
+        </w:tc>
+        <w:tc>
+          <w:tcPr>
+            <w:tcW w:type="dxa" w:w="1234"/>
+          </w:tcPr>
+          <w:p>
+            <w:r>
+              <w:t>P0 — shipped (v5.0)</w:t>
+            </w:r>
+          </w:p>
+        </w:tc>
+      </w:tr>
+      <w:tr>
+        <w:tc>
+          <w:tcPr>
+            <w:tcW w:type="dxa" w:w="1234"/>
+          </w:tcPr>
+          <w:p>
+            <w:r>
+              <w:t>Summary tab: In Flight / Plan / Heatmap</w:t>
+            </w:r>
+          </w:p>
+        </w:tc>
+        <w:tc>
+          <w:tcPr>
+            <w:tcW w:type="dxa" w:w="1234"/>
+          </w:tcPr>
+          <w:p>
+            <w:r>
+              <w:t>High</w:t>
+            </w:r>
+          </w:p>
+        </w:tc>
+        <w:tc>
+          <w:tcPr>
+            <w:tcW w:type="dxa" w:w="1234"/>
+          </w:tcPr>
+          <w:p>
+            <w:r>
+              <w:t>High</w:t>
+            </w:r>
+          </w:p>
+        </w:tc>
+        <w:tc>
+          <w:tcPr>
+            <w:tcW w:type="dxa" w:w="1234"/>
+          </w:tcPr>
+          <w:p>
+            <w:r>
+              <w:t>99%</w:t>
+            </w:r>
+          </w:p>
+        </w:tc>
+        <w:tc>
+          <w:tcPr>
+            <w:tcW w:type="dxa" w:w="1234"/>
+          </w:tcPr>
+          <w:p>
+            <w:r>
+              <w:t>S</w:t>
+            </w:r>
+          </w:p>
+        </w:tc>
+        <w:tc>
+          <w:tcPr>
+            <w:tcW w:type="dxa" w:w="1234"/>
+          </w:tcPr>
+          <w:p>
+            <w:r>
+              <w:t>9.9</w:t>
+            </w:r>
+          </w:p>
+        </w:tc>
+        <w:tc>
+          <w:tcPr>
+            <w:tcW w:type="dxa" w:w="1234"/>
+          </w:tcPr>
+          <w:p>
+            <w:r>
+              <w:t>P1 — shipped (v5.1)</w:t>
+            </w:r>
+          </w:p>
+        </w:tc>
+      </w:tr>
+      <w:tr>
+        <w:tc>
+          <w:tcPr>
+            <w:tcW w:type="dxa" w:w="1234"/>
+          </w:tcPr>
+          <w:p>
+            <w:r>
+              <w:t>Automated EOD eval + Agent Scorecard</w:t>
+            </w:r>
+          </w:p>
+        </w:tc>
+        <w:tc>
+          <w:tcPr>
+            <w:tcW w:type="dxa" w:w="1234"/>
+          </w:tcPr>
+          <w:p>
+            <w:r>
+              <w:t>High</w:t>
+            </w:r>
+          </w:p>
+        </w:tc>
+        <w:tc>
+          <w:tcPr>
+            <w:tcW w:type="dxa" w:w="1234"/>
+          </w:tcPr>
+          <w:p>
+            <w:r>
+              <w:t>High</w:t>
+            </w:r>
+          </w:p>
+        </w:tc>
+        <w:tc>
+          <w:tcPr>
+            <w:tcW w:type="dxa" w:w="1234"/>
+          </w:tcPr>
+          <w:p>
+            <w:r>
+              <w:t>99%</w:t>
+            </w:r>
+          </w:p>
+        </w:tc>
+        <w:tc>
+          <w:tcPr>
+            <w:tcW w:type="dxa" w:w="1234"/>
+          </w:tcPr>
+          <w:p>
+            <w:r>
+              <w:t>S</w:t>
+            </w:r>
+          </w:p>
+        </w:tc>
+        <w:tc>
+          <w:tcPr>
+            <w:tcW w:type="dxa" w:w="1234"/>
+          </w:tcPr>
+          <w:p>
+            <w:r>
+              <w:t>9.9</w:t>
+            </w:r>
+          </w:p>
+        </w:tc>
+        <w:tc>
+          <w:tcPr>
+            <w:tcW w:type="dxa" w:w="1234"/>
+          </w:tcPr>
+          <w:p>
+            <w:r>
+              <w:t>P1 — shipped (v5.1)</w:t>
+            </w:r>
+          </w:p>
+        </w:tc>
+      </w:tr>
+      <w:tr>
+        <w:tc>
+          <w:tcPr>
+            <w:tcW w:type="dxa" w:w="1234"/>
+          </w:tcPr>
+          <w:p>
+            <w:r>
+              <w:t>Alpaca position reconciliation (UNFILLED)</w:t>
+            </w:r>
+          </w:p>
+        </w:tc>
+        <w:tc>
+          <w:tcPr>
+            <w:tcW w:type="dxa" w:w="1234"/>
+          </w:tcPr>
+          <w:p>
+            <w:r>
+              <w:t>High</w:t>
+            </w:r>
+          </w:p>
+        </w:tc>
+        <w:tc>
+          <w:tcPr>
+            <w:tcW w:type="dxa" w:w="1234"/>
+          </w:tcPr>
+          <w:p>
+            <w:r>
+              <w:t>High</w:t>
+            </w:r>
+          </w:p>
+        </w:tc>
+        <w:tc>
+          <w:tcPr>
+            <w:tcW w:type="dxa" w:w="1234"/>
+          </w:tcPr>
+          <w:p>
+            <w:r>
+              <w:t>95%</w:t>
+            </w:r>
+          </w:p>
+        </w:tc>
+        <w:tc>
+          <w:tcPr>
+            <w:tcW w:type="dxa" w:w="1234"/>
+          </w:tcPr>
+          <w:p>
+            <w:r>
+              <w:t>S</w:t>
+            </w:r>
+          </w:p>
+        </w:tc>
+        <w:tc>
+          <w:tcPr>
+            <w:tcW w:type="dxa" w:w="1234"/>
+          </w:tcPr>
+          <w:p>
+            <w:r>
+              <w:t>9.5</w:t>
+            </w:r>
+          </w:p>
+        </w:tc>
+        <w:tc>
+          <w:tcPr>
+            <w:tcW w:type="dxa" w:w="1234"/>
+          </w:tcPr>
+          <w:p>
+            <w:r>
+              <w:t>P1 — shipped (v5.1)</w:t>
+            </w:r>
+          </w:p>
+        </w:tc>
+      </w:tr>
+      <w:tr>
+        <w:tc>
+          <w:tcPr>
+            <w:tcW w:type="dxa" w:w="1234"/>
+          </w:tcPr>
+          <w:p>
+            <w:r>
+              <w:t>No-margin cumulative capital check</w:t>
+            </w:r>
+          </w:p>
+        </w:tc>
+        <w:tc>
+          <w:tcPr>
+            <w:tcW w:type="dxa" w:w="1234"/>
+          </w:tcPr>
+          <w:p>
+            <w:r>
+              <w:t>High</w:t>
+            </w:r>
+          </w:p>
+        </w:tc>
+        <w:tc>
+          <w:tcPr>
+            <w:tcW w:type="dxa" w:w="1234"/>
+          </w:tcPr>
+          <w:p>
+            <w:r>
+              <w:t>High</w:t>
+            </w:r>
+          </w:p>
+        </w:tc>
+        <w:tc>
+          <w:tcPr>
+            <w:tcW w:type="dxa" w:w="1234"/>
+          </w:tcPr>
+          <w:p>
+            <w:r>
+              <w:t>99%</w:t>
+            </w:r>
+          </w:p>
+        </w:tc>
+        <w:tc>
+          <w:tcPr>
+            <w:tcW w:type="dxa" w:w="1234"/>
+          </w:tcPr>
+          <w:p>
+            <w:r>
+              <w:t>S</w:t>
+            </w:r>
+          </w:p>
+        </w:tc>
+        <w:tc>
+          <w:tcPr>
+            <w:tcW w:type="dxa" w:w="1234"/>
+          </w:tcPr>
+          <w:p>
+            <w:r>
+              <w:t>9.9</w:t>
+            </w:r>
+          </w:p>
+        </w:tc>
+        <w:tc>
+          <w:tcPr>
+            <w:tcW w:type="dxa" w:w="1234"/>
+          </w:tcPr>
+          <w:p>
+            <w:r>
+              <w:t>P0 — shipped (v5.2)</w:t>
+            </w:r>
+          </w:p>
+        </w:tc>
+      </w:tr>
+      <w:tr>
+        <w:tc>
+          <w:tcPr>
+            <w:tcW w:type="dxa" w:w="1234"/>
+          </w:tcPr>
+          <w:p>
+            <w:r>
+              <w:t>Daily profit lock-in (LOCK_IN at $716)</w:t>
+            </w:r>
+          </w:p>
+        </w:tc>
+        <w:tc>
+          <w:tcPr>
+            <w:tcW w:type="dxa" w:w="1234"/>
+          </w:tcPr>
+          <w:p>
+            <w:r>
+              <w:t>High</w:t>
+            </w:r>
+          </w:p>
+        </w:tc>
+        <w:tc>
+          <w:tcPr>
+            <w:tcW w:type="dxa" w:w="1234"/>
+          </w:tcPr>
+          <w:p>
+            <w:r>
+              <w:t>High</w:t>
+            </w:r>
+          </w:p>
+        </w:tc>
+        <w:tc>
+          <w:tcPr>
+            <w:tcW w:type="dxa" w:w="1234"/>
+          </w:tcPr>
+          <w:p>
+            <w:r>
+              <w:t>95%</w:t>
+            </w:r>
+          </w:p>
+        </w:tc>
+        <w:tc>
+          <w:tcPr>
+            <w:tcW w:type="dxa" w:w="1234"/>
+          </w:tcPr>
+          <w:p>
+            <w:r>
+              <w:t>S</w:t>
+            </w:r>
+          </w:p>
+        </w:tc>
+        <w:tc>
+          <w:tcPr>
+            <w:tcW w:type="dxa" w:w="1234"/>
+          </w:tcPr>
+          <w:p>
+            <w:r>
+              <w:t>9.5</w:t>
+            </w:r>
+          </w:p>
+        </w:tc>
+        <w:tc>
+          <w:tcPr>
+            <w:tcW w:type="dxa" w:w="1234"/>
+          </w:tcPr>
+          <w:p>
+            <w:r>
+              <w:t>P1 — shipped (v5.2)</w:t>
+            </w:r>
+          </w:p>
+        </w:tc>
+      </w:tr>
+      <w:tr>
+        <w:tc>
+          <w:tcPr>
+            <w:tcW w:type="dxa" w:w="1234"/>
+          </w:tcPr>
+          <w:p>
+            <w:r>
+              <w:t>GitHub Actions retry (3x with 60s backoff)</w:t>
+            </w:r>
+          </w:p>
+        </w:tc>
+        <w:tc>
+          <w:tcPr>
+            <w:tcW w:type="dxa" w:w="1234"/>
+          </w:tcPr>
+          <w:p>
+            <w:r>
+              <w:t>High</w:t>
+            </w:r>
+          </w:p>
+        </w:tc>
+        <w:tc>
+          <w:tcPr>
+            <w:tcW w:type="dxa" w:w="1234"/>
+          </w:tcPr>
+          <w:p>
+            <w:r>
+              <w:t>High</w:t>
+            </w:r>
+          </w:p>
+        </w:tc>
+        <w:tc>
+          <w:tcPr>
+            <w:tcW w:type="dxa" w:w="1234"/>
+          </w:tcPr>
+          <w:p>
+            <w:r>
+              <w:t>99%</w:t>
+            </w:r>
+          </w:p>
+        </w:tc>
+        <w:tc>
+          <w:tcPr>
+            <w:tcW w:type="dxa" w:w="1234"/>
+          </w:tcPr>
+          <w:p>
+            <w:r>
+              <w:t>XS</w:t>
+            </w:r>
+          </w:p>
+        </w:tc>
+        <w:tc>
+          <w:tcPr>
+            <w:tcW w:type="dxa" w:w="1234"/>
+          </w:tcPr>
+          <w:p>
+            <w:r>
+              <w:t>9.9</w:t>
+            </w:r>
+          </w:p>
+        </w:tc>
+        <w:tc>
+          <w:tcPr>
+            <w:tcW w:type="dxa" w:w="1234"/>
+          </w:tcPr>
+          <w:p>
+            <w:r>
+              <w:t>P0 — shipped (v5.3)</w:t>
+            </w:r>
+          </w:p>
+        </w:tc>
+      </w:tr>
+      <w:tr>
+        <w:tc>
+          <w:tcPr>
+            <w:tcW w:type="dxa" w:w="1234"/>
+          </w:tcPr>
+          <w:p>
+            <w:r>
+              <w:t>Trailing stops (high_watermark + 1% trail)</w:t>
+            </w:r>
+          </w:p>
+        </w:tc>
+        <w:tc>
+          <w:tcPr>
+            <w:tcW w:type="dxa" w:w="1234"/>
+          </w:tcPr>
+          <w:p>
+            <w:r>
+              <w:t>High</w:t>
+            </w:r>
+          </w:p>
+        </w:tc>
+        <w:tc>
+          <w:tcPr>
+            <w:tcW w:type="dxa" w:w="1234"/>
+          </w:tcPr>
+          <w:p>
+            <w:r>
+              <w:t>High</w:t>
+            </w:r>
+          </w:p>
+        </w:tc>
+        <w:tc>
+          <w:tcPr>
+            <w:tcW w:type="dxa" w:w="1234"/>
+          </w:tcPr>
+          <w:p>
+            <w:r>
+              <w:t>90%</w:t>
+            </w:r>
+          </w:p>
+        </w:tc>
+        <w:tc>
+          <w:tcPr>
+            <w:tcW w:type="dxa" w:w="1234"/>
+          </w:tcPr>
+          <w:p>
+            <w:r>
+              <w:t>S</w:t>
+            </w:r>
+          </w:p>
+        </w:tc>
+        <w:tc>
+          <w:tcPr>
+            <w:tcW w:type="dxa" w:w="1234"/>
+          </w:tcPr>
+          <w:p>
+            <w:r>
+              <w:t>9.0</w:t>
+            </w:r>
+          </w:p>
+        </w:tc>
+        <w:tc>
+          <w:tcPr>
+            <w:tcW w:type="dxa" w:w="1234"/>
+          </w:tcPr>
+          <w:p>
+            <w:r>
+              <w:t>P1 — shipped (v5.3)</w:t>
+            </w:r>
+          </w:p>
+        </w:tc>
+      </w:tr>
+      <w:tr>
+        <w:tc>
+          <w:tcPr>
+            <w:tcW w:type="dxa" w:w="1234"/>
+          </w:tcPr>
+          <w:p>
+            <w:r>
+              <w:t>Confidence-weighted position sizing</w:t>
+            </w:r>
+          </w:p>
+        </w:tc>
+        <w:tc>
+          <w:tcPr>
+            <w:tcW w:type="dxa" w:w="1234"/>
+          </w:tcPr>
+          <w:p>
+            <w:r>
+              <w:t>High</w:t>
+            </w:r>
+          </w:p>
+        </w:tc>
+        <w:tc>
+          <w:tcPr>
+            <w:tcW w:type="dxa" w:w="1234"/>
+          </w:tcPr>
+          <w:p>
+            <w:r>
+              <w:t>Med</w:t>
+            </w:r>
+          </w:p>
+        </w:tc>
+        <w:tc>
+          <w:tcPr>
+            <w:tcW w:type="dxa" w:w="1234"/>
+          </w:tcPr>
+          <w:p>
+            <w:r>
+              <w:t>95%</w:t>
+            </w:r>
+          </w:p>
+        </w:tc>
+        <w:tc>
+          <w:tcPr>
+            <w:tcW w:type="dxa" w:w="1234"/>
+          </w:tcPr>
+          <w:p>
+            <w:r>
+              <w:t>XS</w:t>
+            </w:r>
+          </w:p>
+        </w:tc>
+        <w:tc>
+          <w:tcPr>
+            <w:tcW w:type="dxa" w:w="1234"/>
+          </w:tcPr>
+          <w:p>
+            <w:r>
+              <w:t>8.6</w:t>
+            </w:r>
+          </w:p>
+        </w:tc>
+        <w:tc>
+          <w:tcPr>
+            <w:tcW w:type="dxa" w:w="1234"/>
+          </w:tcPr>
+          <w:p>
+            <w:r>
+              <w:t>P1 — shipped (v5.3)</w:t>
+            </w:r>
+          </w:p>
+        </w:tc>
+      </w:tr>
+      <w:tr>
+        <w:tc>
+          <w:tcPr>
+            <w:tcW w:type="dxa" w:w="1234"/>
+          </w:tcPr>
+          <w:p>
+            <w:r>
               <w:t>Dashboard trail stop annotations</w:t>
             </w:r>
           </w:p>
@@ -4397,6 +4793,654 @@
           <w:p>
             <w:r>
               <w:t>P1 — shipped (v5.3)</w:t>
+            </w:r>
+          </w:p>
+        </w:tc>
+      </w:tr>
+      <w:tr>
+        <w:tc>
+          <w:tcPr>
+            <w:tcW w:type="dxa" w:w="1234"/>
+          </w:tcPr>
+          <w:p>
+            <w:r>
+              <w:t>Prompt caching (strategy SYSTEM ephemeral)</w:t>
+            </w:r>
+          </w:p>
+        </w:tc>
+        <w:tc>
+          <w:tcPr>
+            <w:tcW w:type="dxa" w:w="1234"/>
+          </w:tcPr>
+          <w:p>
+            <w:r>
+              <w:t>High</w:t>
+            </w:r>
+          </w:p>
+        </w:tc>
+        <w:tc>
+          <w:tcPr>
+            <w:tcW w:type="dxa" w:w="1234"/>
+          </w:tcPr>
+          <w:p>
+            <w:r>
+              <w:t>Med</w:t>
+            </w:r>
+          </w:p>
+        </w:tc>
+        <w:tc>
+          <w:tcPr>
+            <w:tcW w:type="dxa" w:w="1234"/>
+          </w:tcPr>
+          <w:p>
+            <w:r>
+              <w:t>99%</w:t>
+            </w:r>
+          </w:p>
+        </w:tc>
+        <w:tc>
+          <w:tcPr>
+            <w:tcW w:type="dxa" w:w="1234"/>
+          </w:tcPr>
+          <w:p>
+            <w:r>
+              <w:t>XS</w:t>
+            </w:r>
+          </w:p>
+        </w:tc>
+        <w:tc>
+          <w:tcPr>
+            <w:tcW w:type="dxa" w:w="1234"/>
+          </w:tcPr>
+          <w:p>
+            <w:r>
+              <w:t>9.0</w:t>
+            </w:r>
+          </w:p>
+        </w:tc>
+        <w:tc>
+          <w:tcPr>
+            <w:tcW w:type="dxa" w:w="1234"/>
+          </w:tcPr>
+          <w:p>
+            <w:r>
+              <w:t>P1 — shipped (v5.4)</w:t>
+            </w:r>
+          </w:p>
+        </w:tc>
+      </w:tr>
+      <w:tr>
+        <w:tc>
+          <w:tcPr>
+            <w:tcW w:type="dxa" w:w="1234"/>
+          </w:tcPr>
+          <w:p>
+            <w:r>
+              <w:t>Strategy pre-filter (score gate before Claude)</w:t>
+            </w:r>
+          </w:p>
+        </w:tc>
+        <w:tc>
+          <w:tcPr>
+            <w:tcW w:type="dxa" w:w="1234"/>
+          </w:tcPr>
+          <w:p>
+            <w:r>
+              <w:t>High</w:t>
+            </w:r>
+          </w:p>
+        </w:tc>
+        <w:tc>
+          <w:tcPr>
+            <w:tcW w:type="dxa" w:w="1234"/>
+          </w:tcPr>
+          <w:p>
+            <w:r>
+              <w:t>Med</w:t>
+            </w:r>
+          </w:p>
+        </w:tc>
+        <w:tc>
+          <w:tcPr>
+            <w:tcW w:type="dxa" w:w="1234"/>
+          </w:tcPr>
+          <w:p>
+            <w:r>
+              <w:t>99%</w:t>
+            </w:r>
+          </w:p>
+        </w:tc>
+        <w:tc>
+          <w:tcPr>
+            <w:tcW w:type="dxa" w:w="1234"/>
+          </w:tcPr>
+          <w:p>
+            <w:r>
+              <w:t>XS</w:t>
+            </w:r>
+          </w:p>
+        </w:tc>
+        <w:tc>
+          <w:tcPr>
+            <w:tcW w:type="dxa" w:w="1234"/>
+          </w:tcPr>
+          <w:p>
+            <w:r>
+              <w:t>9.0</w:t>
+            </w:r>
+          </w:p>
+        </w:tc>
+        <w:tc>
+          <w:tcPr>
+            <w:tcW w:type="dxa" w:w="1234"/>
+          </w:tcPr>
+          <w:p>
+            <w:r>
+              <w:t>P1 — shipped (v5.4)</w:t>
+            </w:r>
+          </w:p>
+        </w:tc>
+      </w:tr>
+      <w:tr>
+        <w:tc>
+          <w:tcPr>
+            <w:tcW w:type="dxa" w:w="1234"/>
+          </w:tcPr>
+          <w:p>
+            <w:r>
+              <w:t>1M liquidity floor (was 500K)</w:t>
+            </w:r>
+          </w:p>
+        </w:tc>
+        <w:tc>
+          <w:tcPr>
+            <w:tcW w:type="dxa" w:w="1234"/>
+          </w:tcPr>
+          <w:p>
+            <w:r>
+              <w:t>High</w:t>
+            </w:r>
+          </w:p>
+        </w:tc>
+        <w:tc>
+          <w:tcPr>
+            <w:tcW w:type="dxa" w:w="1234"/>
+          </w:tcPr>
+          <w:p>
+            <w:r>
+              <w:t>High</w:t>
+            </w:r>
+          </w:p>
+        </w:tc>
+        <w:tc>
+          <w:tcPr>
+            <w:tcW w:type="dxa" w:w="1234"/>
+          </w:tcPr>
+          <w:p>
+            <w:r>
+              <w:t>95%</w:t>
+            </w:r>
+          </w:p>
+        </w:tc>
+        <w:tc>
+          <w:tcPr>
+            <w:tcW w:type="dxa" w:w="1234"/>
+          </w:tcPr>
+          <w:p>
+            <w:r>
+              <w:t>XS</w:t>
+            </w:r>
+          </w:p>
+        </w:tc>
+        <w:tc>
+          <w:tcPr>
+            <w:tcW w:type="dxa" w:w="1234"/>
+          </w:tcPr>
+          <w:p>
+            <w:r>
+              <w:t>9.5</w:t>
+            </w:r>
+          </w:p>
+        </w:tc>
+        <w:tc>
+          <w:tcPr>
+            <w:tcW w:type="dxa" w:w="1234"/>
+          </w:tcPr>
+          <w:p>
+            <w:r>
+              <w:t>P1 — shipped (v5.4)</w:t>
+            </w:r>
+          </w:p>
+        </w:tc>
+      </w:tr>
+      <w:tr>
+        <w:tc>
+          <w:tcPr>
+            <w:tcW w:type="dxa" w:w="1234"/>
+          </w:tcPr>
+          <w:p>
+            <w:r>
+              <w:t>Real-time Alpaca price refresh (step 1.8)</w:t>
+            </w:r>
+          </w:p>
+        </w:tc>
+        <w:tc>
+          <w:tcPr>
+            <w:tcW w:type="dxa" w:w="1234"/>
+          </w:tcPr>
+          <w:p>
+            <w:r>
+              <w:t>High</w:t>
+            </w:r>
+          </w:p>
+        </w:tc>
+        <w:tc>
+          <w:tcPr>
+            <w:tcW w:type="dxa" w:w="1234"/>
+          </w:tcPr>
+          <w:p>
+            <w:r>
+              <w:t>High</w:t>
+            </w:r>
+          </w:p>
+        </w:tc>
+        <w:tc>
+          <w:tcPr>
+            <w:tcW w:type="dxa" w:w="1234"/>
+          </w:tcPr>
+          <w:p>
+            <w:r>
+              <w:t>90%</w:t>
+            </w:r>
+          </w:p>
+        </w:tc>
+        <w:tc>
+          <w:tcPr>
+            <w:tcW w:type="dxa" w:w="1234"/>
+          </w:tcPr>
+          <w:p>
+            <w:r>
+              <w:t>S</w:t>
+            </w:r>
+          </w:p>
+        </w:tc>
+        <w:tc>
+          <w:tcPr>
+            <w:tcW w:type="dxa" w:w="1234"/>
+          </w:tcPr>
+          <w:p>
+            <w:r>
+              <w:t>9.0</w:t>
+            </w:r>
+          </w:p>
+        </w:tc>
+        <w:tc>
+          <w:tcPr>
+            <w:tcW w:type="dxa" w:w="1234"/>
+          </w:tcPr>
+          <w:p>
+            <w:r>
+              <w:t>P1 — shipped (v5.4)</w:t>
+            </w:r>
+          </w:p>
+        </w:tc>
+      </w:tr>
+      <w:tr>
+        <w:tc>
+          <w:tcPr>
+            <w:tcW w:type="dxa" w:w="1234"/>
+          </w:tcPr>
+          <w:p>
+            <w:r>
+              <w:t>Limit order entries (was market orders)</w:t>
+            </w:r>
+          </w:p>
+        </w:tc>
+        <w:tc>
+          <w:tcPr>
+            <w:tcW w:type="dxa" w:w="1234"/>
+          </w:tcPr>
+          <w:p>
+            <w:r>
+              <w:t>High</w:t>
+            </w:r>
+          </w:p>
+        </w:tc>
+        <w:tc>
+          <w:tcPr>
+            <w:tcW w:type="dxa" w:w="1234"/>
+          </w:tcPr>
+          <w:p>
+            <w:r>
+              <w:t>High</w:t>
+            </w:r>
+          </w:p>
+        </w:tc>
+        <w:tc>
+          <w:tcPr>
+            <w:tcW w:type="dxa" w:w="1234"/>
+          </w:tcPr>
+          <w:p>
+            <w:r>
+              <w:t>95%</w:t>
+            </w:r>
+          </w:p>
+        </w:tc>
+        <w:tc>
+          <w:tcPr>
+            <w:tcW w:type="dxa" w:w="1234"/>
+          </w:tcPr>
+          <w:p>
+            <w:r>
+              <w:t>S</w:t>
+            </w:r>
+          </w:p>
+        </w:tc>
+        <w:tc>
+          <w:tcPr>
+            <w:tcW w:type="dxa" w:w="1234"/>
+          </w:tcPr>
+          <w:p>
+            <w:r>
+              <w:t>9.5</w:t>
+            </w:r>
+          </w:p>
+        </w:tc>
+        <w:tc>
+          <w:tcPr>
+            <w:tcW w:type="dxa" w:w="1234"/>
+          </w:tcPr>
+          <w:p>
+            <w:r>
+              <w:t>P1 — shipped (v5.4)</w:t>
+            </w:r>
+          </w:p>
+        </w:tc>
+      </w:tr>
+      <w:tr>
+        <w:tc>
+          <w:tcPr>
+            <w:tcW w:type="dxa" w:w="1234"/>
+          </w:tcPr>
+          <w:p>
+            <w:r>
+              <w:t>Premarket 9:45 AM ET (skip first 15 min)</w:t>
+            </w:r>
+          </w:p>
+        </w:tc>
+        <w:tc>
+          <w:tcPr>
+            <w:tcW w:type="dxa" w:w="1234"/>
+          </w:tcPr>
+          <w:p>
+            <w:r>
+              <w:t>High</w:t>
+            </w:r>
+          </w:p>
+        </w:tc>
+        <w:tc>
+          <w:tcPr>
+            <w:tcW w:type="dxa" w:w="1234"/>
+          </w:tcPr>
+          <w:p>
+            <w:r>
+              <w:t>High</w:t>
+            </w:r>
+          </w:p>
+        </w:tc>
+        <w:tc>
+          <w:tcPr>
+            <w:tcW w:type="dxa" w:w="1234"/>
+          </w:tcPr>
+          <w:p>
+            <w:r>
+              <w:t>95%</w:t>
+            </w:r>
+          </w:p>
+        </w:tc>
+        <w:tc>
+          <w:tcPr>
+            <w:tcW w:type="dxa" w:w="1234"/>
+          </w:tcPr>
+          <w:p>
+            <w:r>
+              <w:t>XS</w:t>
+            </w:r>
+          </w:p>
+        </w:tc>
+        <w:tc>
+          <w:tcPr>
+            <w:tcW w:type="dxa" w:w="1234"/>
+          </w:tcPr>
+          <w:p>
+            <w:r>
+              <w:t>9.5</w:t>
+            </w:r>
+          </w:p>
+        </w:tc>
+        <w:tc>
+          <w:tcPr>
+            <w:tcW w:type="dxa" w:w="1234"/>
+          </w:tcPr>
+          <w:p>
+            <w:r>
+              <w:t>P1 — shipped (v5.4)</w:t>
+            </w:r>
+          </w:p>
+        </w:tc>
+      </w:tr>
+      <w:tr>
+        <w:tc>
+          <w:tcPr>
+            <w:tcW w:type="dxa" w:w="1234"/>
+          </w:tcPr>
+          <w:p>
+            <w:r>
+              <w:t>15-min intraday checks (was 30 min)</w:t>
+            </w:r>
+          </w:p>
+        </w:tc>
+        <w:tc>
+          <w:tcPr>
+            <w:tcW w:type="dxa" w:w="1234"/>
+          </w:tcPr>
+          <w:p>
+            <w:r>
+              <w:t>High</w:t>
+            </w:r>
+          </w:p>
+        </w:tc>
+        <w:tc>
+          <w:tcPr>
+            <w:tcW w:type="dxa" w:w="1234"/>
+          </w:tcPr>
+          <w:p>
+            <w:r>
+              <w:t>Med</w:t>
+            </w:r>
+          </w:p>
+        </w:tc>
+        <w:tc>
+          <w:tcPr>
+            <w:tcW w:type="dxa" w:w="1234"/>
+          </w:tcPr>
+          <w:p>
+            <w:r>
+              <w:t>95%</w:t>
+            </w:r>
+          </w:p>
+        </w:tc>
+        <w:tc>
+          <w:tcPr>
+            <w:tcW w:type="dxa" w:w="1234"/>
+          </w:tcPr>
+          <w:p>
+            <w:r>
+              <w:t>XS</w:t>
+            </w:r>
+          </w:p>
+        </w:tc>
+        <w:tc>
+          <w:tcPr>
+            <w:tcW w:type="dxa" w:w="1234"/>
+          </w:tcPr>
+          <w:p>
+            <w:r>
+              <w:t>9.0</w:t>
+            </w:r>
+          </w:p>
+        </w:tc>
+        <w:tc>
+          <w:tcPr>
+            <w:tcW w:type="dxa" w:w="1234"/>
+          </w:tcPr>
+          <w:p>
+            <w:r>
+              <w:t>P1 — shipped (v5.4)</w:t>
+            </w:r>
+          </w:p>
+        </w:tc>
+      </w:tr>
+      <w:tr>
+        <w:tc>
+          <w:tcPr>
+            <w:tcW w:type="dxa" w:w="1234"/>
+          </w:tcPr>
+          <w:p>
+            <w:r>
+              <w:t>cron-job.org external triggers</w:t>
+            </w:r>
+          </w:p>
+        </w:tc>
+        <w:tc>
+          <w:tcPr>
+            <w:tcW w:type="dxa" w:w="1234"/>
+          </w:tcPr>
+          <w:p>
+            <w:r>
+              <w:t>High</w:t>
+            </w:r>
+          </w:p>
+        </w:tc>
+        <w:tc>
+          <w:tcPr>
+            <w:tcW w:type="dxa" w:w="1234"/>
+          </w:tcPr>
+          <w:p>
+            <w:r>
+              <w:t>High</w:t>
+            </w:r>
+          </w:p>
+        </w:tc>
+        <w:tc>
+          <w:tcPr>
+            <w:tcW w:type="dxa" w:w="1234"/>
+          </w:tcPr>
+          <w:p>
+            <w:r>
+              <w:t>99%</w:t>
+            </w:r>
+          </w:p>
+        </w:tc>
+        <w:tc>
+          <w:tcPr>
+            <w:tcW w:type="dxa" w:w="1234"/>
+          </w:tcPr>
+          <w:p>
+            <w:r>
+              <w:t>S</w:t>
+            </w:r>
+          </w:p>
+        </w:tc>
+        <w:tc>
+          <w:tcPr>
+            <w:tcW w:type="dxa" w:w="1234"/>
+          </w:tcPr>
+          <w:p>
+            <w:r>
+              <w:t>9.9</w:t>
+            </w:r>
+          </w:p>
+        </w:tc>
+        <w:tc>
+          <w:tcPr>
+            <w:tcW w:type="dxa" w:w="1234"/>
+          </w:tcPr>
+          <w:p>
+            <w:r>
+              <w:t>P0 — shipped (v5.4)</w:t>
+            </w:r>
+          </w:p>
+        </w:tc>
+      </w:tr>
+      <w:tr>
+        <w:tc>
+          <w:tcPr>
+            <w:tcW w:type="dxa" w:w="1234"/>
+          </w:tcPr>
+          <w:p>
+            <w:r>
+              <w:t>Native trailing stop (OTO-OCO)</w:t>
+            </w:r>
+          </w:p>
+        </w:tc>
+        <w:tc>
+          <w:tcPr>
+            <w:tcW w:type="dxa" w:w="1234"/>
+          </w:tcPr>
+          <w:p>
+            <w:r>
+              <w:t>High</w:t>
+            </w:r>
+          </w:p>
+        </w:tc>
+        <w:tc>
+          <w:tcPr>
+            <w:tcW w:type="dxa" w:w="1234"/>
+          </w:tcPr>
+          <w:p>
+            <w:r>
+              <w:t>High</w:t>
+            </w:r>
+          </w:p>
+        </w:tc>
+        <w:tc>
+          <w:tcPr>
+            <w:tcW w:type="dxa" w:w="1234"/>
+          </w:tcPr>
+          <w:p>
+            <w:r>
+              <w:t>80%</w:t>
+            </w:r>
+          </w:p>
+        </w:tc>
+        <w:tc>
+          <w:tcPr>
+            <w:tcW w:type="dxa" w:w="1234"/>
+          </w:tcPr>
+          <w:p>
+            <w:r>
+              <w:t>L</w:t>
+            </w:r>
+          </w:p>
+        </w:tc>
+        <w:tc>
+          <w:tcPr>
+            <w:tcW w:type="dxa" w:w="1234"/>
+          </w:tcPr>
+          <w:p>
+            <w:r>
+              <w:t>7.2</w:t>
+            </w:r>
+          </w:p>
+        </w:tc>
+        <w:tc>
+          <w:tcPr>
+            <w:tcW w:type="dxa" w:w="1234"/>
+          </w:tcPr>
+          <w:p>
+            <w:r>
+              <w:t>P0 — pre-real-money</w:t>
             </w:r>
           </w:p>
         </w:tc>
@@ -5056,31 +6100,19 @@
           <w:tcPr>
             <w:tcW w:type="dxa" w:w="2880"/>
           </w:tcPr>
-          <w:p>
-            <w:r>
-              <w:t>Phase 1 — Foundation</w:t>
-            </w:r>
-          </w:p>
+          <w:p/>
         </w:tc>
         <w:tc>
           <w:tcPr>
             <w:tcW w:type="dxa" w:w="2880"/>
           </w:tcPr>
-          <w:p>
-            <w:r>
-              <w:t>May 2026 (complete)</w:t>
-            </w:r>
-          </w:p>
+          <w:p/>
         </w:tc>
         <w:tc>
           <w:tcPr>
             <w:tcW w:type="dxa" w:w="2880"/>
           </w:tcPr>
-          <w:p>
-            <w:r>
-              <w:t>Scanner, strategy agent, risk agent, portfolio sim, GitHub Actions, Supabase, dashboard, backtest</w:t>
-            </w:r>
-          </w:p>
+          <w:p/>
         </w:tc>
       </w:tr>
       <w:tr>
@@ -5090,7 +6122,7 @@
           </w:tcPr>
           <w:p>
             <w:r>
-              <w:t>Phase 2a — Intelligence (V2a–V2c.1)</w:t>
+              <w:t>Phase 1 — Foundation</w:t>
             </w:r>
           </w:p>
         </w:tc>
@@ -5110,7 +6142,7 @@
           </w:tcPr>
           <w:p>
             <w:r>
-              <w:t>VIX gate, futures signal, earnings blackout, news context, Fear &amp; Greed + calendar gates, F&amp;G tuned to confirming signal, workflow dashboard</w:t>
+              <w:t>Scanner, strategy agent, risk agent, portfolio sim, GitHub Actions, Supabase, dashboard, backtest</w:t>
             </w:r>
           </w:p>
         </w:tc>
@@ -5122,7 +6154,7 @@
           </w:tcPr>
           <w:p>
             <w:r>
-              <w:t>Phase 3a — Dynamic Universe (V3a)</w:t>
+              <w:t>Phase 2a — Intelligence (V2a–V2c.1)</w:t>
             </w:r>
           </w:p>
         </w:tc>
@@ -5142,7 +6174,7 @@
           </w:tcPr>
           <w:p>
             <w:r>
-              <w:t>Weekly S&amp;P500+Nasdaq100 screener, 458 tickers on first run, company names in dashboard</w:t>
+              <w:t>VIX gate, futures signal, earnings blackout, news context, Fear &amp; Greed + calendar gates, F&amp;G tuned to confirming signal, workflow dashboard</w:t>
             </w:r>
           </w:p>
         </w:tc>
@@ -5154,7 +6186,7 @@
           </w:tcPr>
           <w:p>
             <w:r>
-              <w:t>Phase 2b — Execution (V2g)</w:t>
+              <w:t>Phase 3a — Dynamic Universe (V3a)</w:t>
             </w:r>
           </w:p>
         </w:tc>
@@ -5174,7 +6206,7 @@
           </w:tcPr>
           <w:p>
             <w:r>
-              <w:t>Alpaca paper trading — real bracket orders (entry + take-profit + stop-loss), position sync, fill price on close</w:t>
+              <w:t>Weekly S&amp;P500+Nasdaq100 screener, 458 tickers on first run, company names in dashboard</w:t>
             </w:r>
           </w:p>
         </w:tc>
@@ -5186,7 +6218,7 @@
           </w:tcPr>
           <w:p>
             <w:r>
-              <w:t>Phase 2c — More Intelligence (V2d)</w:t>
+              <w:t>Phase 2b — Execution (V2g)</w:t>
             </w:r>
           </w:p>
         </w:tc>
@@ -5206,7 +6238,7 @@
           </w:tcPr>
           <w:p>
             <w:r>
-              <w:t>V2d sector correlation guard — max 3 per sector, drops lowest-confidence excess</w:t>
+              <w:t>Alpaca paper trading — real bracket orders (entry + take-profit + stop-loss), position sync, fill price on close</w:t>
             </w:r>
           </w:p>
         </w:tc>
@@ -5218,7 +6250,7 @@
           </w:tcPr>
           <w:p>
             <w:r>
-              <w:t>Phase 2d — Safety (V5)</w:t>
+              <w:t>Phase 2c — More Intelligence (V2d)</w:t>
             </w:r>
           </w:p>
         </w:tc>
@@ -5238,7 +6270,7 @@
           </w:tcPr>
           <w:p>
             <w:r>
-              <w:t>V5 guardrails — 6 safety checks (action whitelist, ticker whitelist, duplicate guard, price sanity, capital check, daily loss limit), concurrent run lock, EOD close retry</w:t>
+              <w:t>V2d sector correlation guard — max 3 per sector, drops lowest-confidence excess</w:t>
             </w:r>
           </w:p>
         </w:tc>
@@ -5250,7 +6282,7 @@
           </w:tcPr>
           <w:p>
             <w:r>
-              <w:t>Phase 2e — More Intelligence</w:t>
+              <w:t>Phase 2d — Safety (V5)</w:t>
             </w:r>
           </w:p>
         </w:tc>
@@ -5260,6 +6292,70 @@
           </w:tcPr>
           <w:p>
             <w:r>
+              <w:t>May 2026 (complete)</w:t>
+            </w:r>
+          </w:p>
+        </w:tc>
+        <w:tc>
+          <w:tcPr>
+            <w:tcW w:type="dxa" w:w="2880"/>
+          </w:tcPr>
+          <w:p>
+            <w:r>
+              <w:t>V5 guardrails — 6 safety checks (action whitelist, ticker whitelist, duplicate guard, price sanity, capital check, daily loss limit), concurrent run lock, EOD close retry</w:t>
+            </w:r>
+          </w:p>
+        </w:tc>
+      </w:tr>
+      <w:tr>
+        <w:tc>
+          <w:tcPr>
+            <w:tcW w:type="dxa" w:w="2880"/>
+          </w:tcPr>
+          <w:p>
+            <w:r>
+              <w:t>Phase 2e — Execution Friction Fixes (v5.4)</w:t>
+            </w:r>
+          </w:p>
+        </w:tc>
+        <w:tc>
+          <w:tcPr>
+            <w:tcW w:type="dxa" w:w="2880"/>
+          </w:tcPr>
+          <w:p>
+            <w:r>
+              <w:t>May 2026 (complete)</w:t>
+            </w:r>
+          </w:p>
+        </w:tc>
+        <w:tc>
+          <w:tcPr>
+            <w:tcW w:type="dxa" w:w="2880"/>
+          </w:tcPr>
+          <w:p>
+            <w:r>
+              <w:t>Prompt caching, pre-filter, 1M volume floor, live prices, limit orders, 9:45 AM start, 15-min intraday, cron-job.org</w:t>
+            </w:r>
+          </w:p>
+        </w:tc>
+      </w:tr>
+      <w:tr>
+        <w:tc>
+          <w:tcPr>
+            <w:tcW w:type="dxa" w:w="2880"/>
+          </w:tcPr>
+          <w:p>
+            <w:r>
+              <w:t>Phase 3 — Real Edge Features</w:t>
+            </w:r>
+          </w:p>
+        </w:tc>
+        <w:tc>
+          <w:tcPr>
+            <w:tcW w:type="dxa" w:w="2880"/>
+          </w:tcPr>
+          <w:p>
+            <w:r>
               <w:t>June 2026</w:t>
             </w:r>
           </w:p>
@@ -5270,7 +6366,7 @@
           </w:tcPr>
           <w:p>
             <w:r>
-              <w:t>V2e sector rotation scoring, V2f momentum confirmation (15-min rule)</w:t>
+              <w:t>V2e sector rotation scoring, V2f momentum confirmation; post-earnings momentum; native trailing stop (P0 pre-real-money)</w:t>
             </w:r>
           </w:p>
         </w:tc>
@@ -5371,7 +6467,7 @@
         <w:ind w:left="360"/>
       </w:pPr>
       <w:r>
-        <w:t>GitHub Actions (cron 9AM ET) → orchestrator.py</w:t>
+        <w:t>cron-job.org → GitHub workflow_dispatch → orchestrator.py (9:45 AM ET)</w:t>
       </w:r>
     </w:p>
     <w:p>
@@ -5389,7 +6485,7 @@
         <w:ind w:left="360"/>
       </w:pPr>
       <w:r>
-        <w:t>Step 1: scanner.py — yfinance + ta → scored candidates JSON (430+ tickers)</w:t>
+        <w:t>Step 1: scanner.py — yfinance + ta → scored candidates JSON (450+ tickers, 1M+ avg volume)</w:t>
       </w:r>
     </w:p>
     <w:p>
@@ -5407,7 +6503,25 @@
         <w:ind w:left="360"/>
       </w:pPr>
       <w:r>
-        <w:t>Step 2: strategy agent (Claude API) — proposed trades JSON</w:t>
+        <w:t>Step 1.75: strategy pre-filter — score &gt;= STRATEGY_MIN_SCORE gate (no Claude API) → ~60–70% token reduction</w:t>
+      </w:r>
+    </w:p>
+    <w:p>
+      <w:pPr>
+        <w:pStyle w:val="ListBullet"/>
+        <w:ind w:left="360"/>
+      </w:pPr>
+      <w:r>
+        <w:t>Step 1.8: live price refresh — Alpaca StockLatestQuoteRequest → ask prices override 15-min stale yfinance prices</w:t>
+      </w:r>
+    </w:p>
+    <w:p>
+      <w:pPr>
+        <w:pStyle w:val="ListBullet"/>
+        <w:ind w:left="360"/>
+      </w:pPr>
+      <w:r>
+        <w:t>Step 2: strategy agent (Claude API, prompt-cached) — proposed trades JSON</w:t>
       </w:r>
     </w:p>
     <w:p>
@@ -5425,7 +6539,7 @@
         <w:ind w:left="360"/>
       </w:pPr>
       <w:r>
-        <w:t>Step 4: portfolio agent → Supabase (trade_plans, planned_trades, positions tables)</w:t>
+        <w:t>Step 4: portfolio agent → LIMIT orders at entry × 1.001 → Supabase (trade_plans, planned_trades, positions tables)</w:t>
       </w:r>
     </w:p>
     <w:p>
@@ -5434,7 +6548,7 @@
         <w:ind w:left="360"/>
       </w:pPr>
       <w:r>
-        <w:t>Intraday: GitHub Actions (every 30 min) → intraday agent → price check → close on target/stop</w:t>
+        <w:t>Intraday: cron-job.org → GitHub workflow_dispatch (every 15 min) → intraday agent → price check → close on target/stop</w:t>
       </w:r>
     </w:p>
     <w:p>
@@ -8690,6 +9804,14 @@
         <w:spacing w:after="120"/>
       </w:pPr>
       <w:r>
+        <w:t>Phase 2e (v5.4, complete): Prompt caching (strategy SYSTEM ephemeral, ~70–75% input token reduction); strategy pre-filter (STRATEGY_MIN_SCORE=4, step 1.75); 1M avg volume liquidity floor; real-time Alpaca price refresh before Claude call (step 1.8); limit order entries at entry × 1.001 (was market orders); premarket moved 9:00 → 9:45 AM ET; intraday every 15 min (was 30 min); cron-job.org external triggers for exact-time scheduling; eval.py date filter fix; futures period fix for Monday availability.</w:t>
+      </w:r>
+    </w:p>
+    <w:p>
+      <w:pPr>
+        <w:spacing w:after="120"/>
+      </w:pPr>
+      <w:r>
         <w:t>Phase 3: V2e sector rotation scoring, V2f momentum confirmation.</w:t>
       </w:r>
     </w:p>
@@ -10105,31 +11227,19 @@
           <w:tcPr>
             <w:tcW w:type="dxa" w:w="2880"/>
           </w:tcPr>
-          <w:p>
-            <w:r>
-              <w:t>Anthropic console has no usage alerts</w:t>
-            </w:r>
-          </w:p>
+          <w:p/>
         </w:tc>
         <w:tc>
           <w:tcPr>
             <w:tcW w:type="dxa" w:w="2880"/>
           </w:tcPr>
-          <w:p>
-            <w:r>
-              <w:t>console.anthropic.com only supports auto-recharge — no threshold alerts or email notifications</w:t>
-            </w:r>
-          </w:p>
+          <w:p/>
         </w:tc>
         <w:tc>
           <w:tcPr>
             <w:tcW w:type="dxa" w:w="2880"/>
           </w:tcPr>
-          <w:p>
-            <w:r>
-              <w:t>Monitor manually weekly; set auto-recharge to avoid service interruption</w:t>
-            </w:r>
-          </w:p>
+          <w:p/>
         </w:tc>
       </w:tr>
       <w:tr>
@@ -10137,31 +11247,19 @@
           <w:tcPr>
             <w:tcW w:type="dxa" w:w="2880"/>
           </w:tcPr>
-          <w:p>
-            <w:r>
-              <w:t>yfinance earnings calendar not always populated</w:t>
-            </w:r>
-          </w:p>
+          <w:p/>
         </w:tc>
         <w:tc>
           <w:tcPr>
             <w:tcW w:type="dxa" w:w="2880"/>
           </w:tcPr>
-          <w:p>
-            <w:r>
-              <w:t>Some tickers have no calendar data — V2b blackout check fails safe (lets them through)</w:t>
-            </w:r>
-          </w:p>
+          <w:p/>
         </w:tc>
         <w:tc>
           <w:tcPr>
             <w:tcW w:type="dxa" w:w="2880"/>
           </w:tcPr>
-          <w:p>
-            <w:r>
-              <w:t>Accept the risk; most major tickers are populated; gaps are edge cases</w:t>
-            </w:r>
-          </w:p>
+          <w:p/>
         </w:tc>
       </w:tr>
       <w:tr>
@@ -10171,7 +11269,7 @@
           </w:tcPr>
           <w:p>
             <w:r>
-              <w:t>git push requires user terminal</w:t>
+              <w:t>Anthropic console has no usage alerts</w:t>
             </w:r>
           </w:p>
         </w:tc>
@@ -10181,7 +11279,7 @@
           </w:tcPr>
           <w:p>
             <w:r>
-              <w:t>Claude Code cannot enter the SSH passphrase interactively — git push must be run from user terminal (resolved by switching to HTTPS PAT)</w:t>
+              <w:t>console.anthropic.com only supports auto-recharge — no threshold alerts or email notifications</w:t>
             </w:r>
           </w:p>
         </w:tc>
@@ -10191,7 +11289,7 @@
           </w:tcPr>
           <w:p>
             <w:r>
-              <w:t>Switch remote to HTTPS with Personal Access Token: git remote set-url origin https://&lt;token&gt;@github.com/amitgarg73/trading-agent.git</w:t>
+              <w:t>Monitor manually weekly; set auto-recharge to avoid service interruption</w:t>
             </w:r>
           </w:p>
         </w:tc>
@@ -10203,6 +11301,70 @@
           </w:tcPr>
           <w:p>
             <w:r>
+              <w:t>yfinance earnings calendar not always populated</w:t>
+            </w:r>
+          </w:p>
+        </w:tc>
+        <w:tc>
+          <w:tcPr>
+            <w:tcW w:type="dxa" w:w="2880"/>
+          </w:tcPr>
+          <w:p>
+            <w:r>
+              <w:t>Some tickers have no calendar data — V2b blackout check fails safe (lets them through)</w:t>
+            </w:r>
+          </w:p>
+        </w:tc>
+        <w:tc>
+          <w:tcPr>
+            <w:tcW w:type="dxa" w:w="2880"/>
+          </w:tcPr>
+          <w:p>
+            <w:r>
+              <w:t>Accept the risk; most major tickers are populated; gaps are edge cases</w:t>
+            </w:r>
+          </w:p>
+        </w:tc>
+      </w:tr>
+      <w:tr>
+        <w:tc>
+          <w:tcPr>
+            <w:tcW w:type="dxa" w:w="2880"/>
+          </w:tcPr>
+          <w:p>
+            <w:r>
+              <w:t>git push requires user terminal</w:t>
+            </w:r>
+          </w:p>
+        </w:tc>
+        <w:tc>
+          <w:tcPr>
+            <w:tcW w:type="dxa" w:w="2880"/>
+          </w:tcPr>
+          <w:p>
+            <w:r>
+              <w:t>Claude Code cannot enter the SSH passphrase interactively — git push must be run from user terminal (resolved by switching to HTTPS PAT)</w:t>
+            </w:r>
+          </w:p>
+        </w:tc>
+        <w:tc>
+          <w:tcPr>
+            <w:tcW w:type="dxa" w:w="2880"/>
+          </w:tcPr>
+          <w:p>
+            <w:r>
+              <w:t>Switch remote to HTTPS with Personal Access Token: git remote set-url origin https://&lt;token&gt;@github.com/amitgarg73/trading-agent.git</w:t>
+            </w:r>
+          </w:p>
+        </w:tc>
+      </w:tr>
+      <w:tr>
+        <w:tc>
+          <w:tcPr>
+            <w:tcW w:type="dxa" w:w="2880"/>
+          </w:tcPr>
+          <w:p>
+            <w:r>
               <w:t>No real-time intraday prices in yfinance free tier</w:t>
             </w:r>
           </w:p>
@@ -10223,7 +11385,71 @@
           </w:tcPr>
           <w:p>
             <w:r>
-              <w:t>Acceptable for paper trading simulation; use paid data feed for live trading</w:t>
+              <w:t>Acceptable for paper trading simulation; v5.4 adds Alpaca live prices at entry; use paid feed for live trading</w:t>
+            </w:r>
+          </w:p>
+        </w:tc>
+      </w:tr>
+      <w:tr>
+        <w:tc>
+          <w:tcPr>
+            <w:tcW w:type="dxa" w:w="2880"/>
+          </w:tcPr>
+          <w:p>
+            <w:r>
+              <w:t>GitHub Actions scheduler fires 5–15 min late</w:t>
+            </w:r>
+          </w:p>
+        </w:tc>
+        <w:tc>
+          <w:tcPr>
+            <w:tcW w:type="dxa" w:w="2880"/>
+          </w:tcPr>
+          <w:p>
+            <w:r>
+              <w:t>GitHub cron is not guaranteed to fire at exact time — premarket delay means entries are placed at stale prices</w:t>
+            </w:r>
+          </w:p>
+        </w:tc>
+        <w:tc>
+          <w:tcPr>
+            <w:tcW w:type="dxa" w:w="2880"/>
+          </w:tcPr>
+          <w:p>
+            <w:r>
+              <w:t>cron-job.org fires workflow_dispatch at exact UTC times; GitHub schedule kept as backup</w:t>
+            </w:r>
+          </w:p>
+        </w:tc>
+      </w:tr>
+      <w:tr>
+        <w:tc>
+          <w:tcPr>
+            <w:tcW w:type="dxa" w:w="2880"/>
+          </w:tcPr>
+          <w:p>
+            <w:r>
+              <w:t>Native trailing stop not yet implemented</w:t>
+            </w:r>
+          </w:p>
+        </w:tc>
+        <w:tc>
+          <w:tcPr>
+            <w:tcW w:type="dxa" w:w="2880"/>
+          </w:tcPr>
+          <w:p>
+            <w:r>
+              <w:t>alpaca-py bracket orders do not support trail_percent in stop leg; 15-min polling can miss fast reversals</w:t>
+            </w:r>
+          </w:p>
+        </w:tc>
+        <w:tc>
+          <w:tcPr>
+            <w:tcW w:type="dxa" w:w="2880"/>
+          </w:tcPr>
+          <w:p>
+            <w:r>
+              <w:t>P0 before real money: build OTO-OCO structure with feature flag + unit tests + 2-week A/B paper test</w:t>
             </w:r>
           </w:p>
         </w:tc>

</xml_diff>